<commit_message>
Cross check notes with actual notes for accuracy
</commit_message>
<xml_diff>
--- a/Sessions Data/Session5-Notes.docx
+++ b/Sessions Data/Session5-Notes.docx
@@ -98,8 +98,21 @@
       <w:r>
         <w:t xml:space="preserve">I work in </w:t>
       </w:r>
-      <w:r>
-        <w:t>Hydroinformatics. Side consulting firm modeling water quantity and water quality. Live in Logan, want to see whats going on here locally, this problem seems solvable</w:t>
+      <w:proofErr w:type="spellStart"/>
+      <w:r>
+        <w:t>Hydroinformatics</w:t>
+      </w:r>
+      <w:proofErr w:type="spellEnd"/>
+      <w:r>
+        <w:t xml:space="preserve">. Side consulting firm modeling water quantity and water quality. Live in Logan, want to see </w:t>
+      </w:r>
+      <w:proofErr w:type="spellStart"/>
+      <w:r>
+        <w:t>whats</w:t>
+      </w:r>
+      <w:proofErr w:type="spellEnd"/>
+      <w:r>
+        <w:t xml:space="preserve"> going on here locally, this problem seems solvable</w:t>
       </w:r>
       <w:r>
         <w:t>.</w:t>
@@ -254,7 +267,15 @@
         <w:t>o,</w:t>
       </w:r>
       <w:r>
-        <w:t xml:space="preserve"> the strategies are not mutually exclusive, can do multiple ones?</w:t>
+        <w:t xml:space="preserve"> the strategies are not mutually exclusive, </w:t>
+      </w:r>
+      <w:proofErr w:type="gramStart"/>
+      <w:r>
+        <w:t>can do</w:t>
+      </w:r>
+      <w:proofErr w:type="gramEnd"/>
+      <w:r>
+        <w:t xml:space="preserve"> multiple ones?</w:t>
       </w:r>
     </w:p>
     <w:p>
@@ -267,7 +288,15 @@
         <w:spacing w:before="240" w:line="276" w:lineRule="auto"/>
       </w:pPr>
       <w:r>
-        <w:t>Is it possible to conserve flow one year and then sell that flow in the next year?</w:t>
+        <w:t xml:space="preserve">Is it possible to conserve </w:t>
+      </w:r>
+      <w:proofErr w:type="gramStart"/>
+      <w:r>
+        <w:t>flow</w:t>
+      </w:r>
+      <w:proofErr w:type="gramEnd"/>
+      <w:r>
+        <w:t xml:space="preserve"> one year and then sell that flow in the next year?</w:t>
       </w:r>
     </w:p>
     <w:p>
@@ -279,8 +308,13 @@
         </w:numPr>
         <w:spacing w:before="240" w:line="276" w:lineRule="auto"/>
       </w:pPr>
-      <w:r>
-        <w:t>So can Cache Valley participate in the bank? Trade money?</w:t>
+      <w:proofErr w:type="gramStart"/>
+      <w:r>
+        <w:t>So</w:t>
+      </w:r>
+      <w:proofErr w:type="gramEnd"/>
+      <w:r>
+        <w:t xml:space="preserve"> can Cache Valley participate in the bank? Trade money?</w:t>
       </w:r>
     </w:p>
     <w:p>
@@ -296,7 +330,15 @@
         <w:t>D</w:t>
       </w:r>
       <w:r>
-        <w:t>oes Cache Valley conserved water go to the lake or to lower users?</w:t>
+        <w:t xml:space="preserve">oes Cache Valley </w:t>
+      </w:r>
+      <w:proofErr w:type="gramStart"/>
+      <w:r>
+        <w:t>conserved</w:t>
+      </w:r>
+      <w:proofErr w:type="gramEnd"/>
+      <w:r>
+        <w:t xml:space="preserve"> water go to the lake or to lower users?</w:t>
       </w:r>
     </w:p>
     <w:p>
@@ -334,7 +376,15 @@
         <w:t xml:space="preserve"> [map for model activity]</w:t>
       </w:r>
       <w:r>
-        <w:t>, I am just thinking about the economics.</w:t>
+        <w:t xml:space="preserve">, I am just thinking about </w:t>
+      </w:r>
+      <w:proofErr w:type="gramStart"/>
+      <w:r>
+        <w:t>the economics</w:t>
+      </w:r>
+      <w:proofErr w:type="gramEnd"/>
+      <w:r>
+        <w:t>.</w:t>
       </w:r>
     </w:p>
     <w:p>
@@ -385,7 +435,15 @@
         <w:spacing w:before="240" w:line="276" w:lineRule="auto"/>
       </w:pPr>
       <w:r>
-        <w:t>Are we doing this for --- or are we actually negotiating this? Because if I am conservative then I wouldn’t let anything go downstream.</w:t>
+        <w:t xml:space="preserve">Are we doing this for --- or are we </w:t>
+      </w:r>
+      <w:proofErr w:type="gramStart"/>
+      <w:r>
+        <w:t>actually negotiating</w:t>
+      </w:r>
+      <w:proofErr w:type="gramEnd"/>
+      <w:r>
+        <w:t xml:space="preserve"> this? Because if I am conservative then I wouldn’t let anything go downstream.</w:t>
       </w:r>
     </w:p>
     <w:p>
@@ -444,7 +502,23 @@
         <w:t xml:space="preserve"> a year off, take</w:t>
       </w:r>
       <w:r>
-        <w:t xml:space="preserve"> the compensation to then buy hay to support their cattle. Folks like the option to sell water one year, and not the next year.</w:t>
+        <w:t xml:space="preserve"> the compensation to then buy hay to support their cattle. Folks like the option to sell </w:t>
+      </w:r>
+      <w:proofErr w:type="gramStart"/>
+      <w:r>
+        <w:t>water</w:t>
+      </w:r>
+      <w:proofErr w:type="gramEnd"/>
+      <w:r>
+        <w:t xml:space="preserve"> one year, and </w:t>
+      </w:r>
+      <w:proofErr w:type="gramStart"/>
+      <w:r>
+        <w:t>not</w:t>
+      </w:r>
+      <w:proofErr w:type="gramEnd"/>
+      <w:r>
+        <w:t xml:space="preserve"> the next year.</w:t>
       </w:r>
     </w:p>
     <w:p>
@@ -459,11 +533,24 @@
       <w:r>
         <w:t xml:space="preserve">AU1: </w:t>
       </w:r>
-      <w:r>
-        <w:t>Talk me though what you are wanting here.</w:t>
-      </w:r>
-      <w:r>
-        <w:t>[R explains and walks them through entering strategies]</w:t>
+      <w:proofErr w:type="gramStart"/>
+      <w:r>
+        <w:t>Talk</w:t>
+      </w:r>
+      <w:proofErr w:type="gramEnd"/>
+      <w:r>
+        <w:t xml:space="preserve"> me though what you are wanting </w:t>
+      </w:r>
+      <w:proofErr w:type="gramStart"/>
+      <w:r>
+        <w:t>here.</w:t>
+      </w:r>
+      <w:r>
+        <w:t>[</w:t>
+      </w:r>
+      <w:proofErr w:type="gramEnd"/>
+      <w:r>
+        <w:t>R explains and walks them through entering strategies]</w:t>
       </w:r>
     </w:p>
     <w:p>
@@ -498,7 +585,15 @@
         <w:t xml:space="preserve"> </w:t>
       </w:r>
       <w:r>
-        <w:t>I don’t see why not. Folks could let all their fields go one year or 50 50. You could pick any percentage</w:t>
+        <w:t xml:space="preserve">I don’t see why not. Folks could let all their fields </w:t>
+      </w:r>
+      <w:proofErr w:type="gramStart"/>
+      <w:r>
+        <w:t>go</w:t>
+      </w:r>
+      <w:proofErr w:type="gramEnd"/>
+      <w:r>
+        <w:t xml:space="preserve"> one year or 50 50. You could pick any percentage</w:t>
       </w:r>
       <w:r>
         <w:t xml:space="preserve"> </w:t>
@@ -525,8 +620,18 @@
           <w:bCs/>
           <w:color w:val="0000FF"/>
         </w:rPr>
-        <w:t>[TIME] 12:36  pm</w:t>
-      </w:r>
+        <w:t xml:space="preserve">[TIME] </w:t>
+      </w:r>
+      <w:proofErr w:type="gramStart"/>
+      <w:r>
+        <w:rPr>
+          <w:b/>
+          <w:bCs/>
+          <w:color w:val="0000FF"/>
+        </w:rPr>
+        <w:t>12:36  pm</w:t>
+      </w:r>
+      <w:proofErr w:type="gramEnd"/>
     </w:p>
     <w:p>
       <w:pPr>
@@ -695,7 +800,15 @@
               </w:rPr>
             </w:pPr>
             <w:r>
-              <w:t xml:space="preserve">Preserve ag (90% floor), conserve to 10% buffer, bank all else </w:t>
+              <w:t xml:space="preserve">Preserve </w:t>
+            </w:r>
+            <w:proofErr w:type="gramStart"/>
+            <w:r>
+              <w:t>ag</w:t>
+            </w:r>
+            <w:proofErr w:type="gramEnd"/>
+            <w:r>
+              <w:t xml:space="preserve"> (90% floor), conserve to 10% buffer, bank all else </w:t>
             </w:r>
           </w:p>
         </w:tc>
@@ -760,7 +873,15 @@
               </w:rPr>
             </w:pPr>
             <w:r>
-              <w:t xml:space="preserve">Preserve ag (90% floor), conserve to 10% buffer, bank all else </w:t>
+              <w:t xml:space="preserve">Preserve </w:t>
+            </w:r>
+            <w:proofErr w:type="gramStart"/>
+            <w:r>
+              <w:t>ag</w:t>
+            </w:r>
+            <w:proofErr w:type="gramEnd"/>
+            <w:r>
+              <w:t xml:space="preserve"> (90% floor), conserve to 10% buffer, bank all else </w:t>
             </w:r>
           </w:p>
         </w:tc>
@@ -819,7 +940,15 @@
               </w:rPr>
             </w:pPr>
             <w:r>
-              <w:t xml:space="preserve">Preserve ag (90% floor), maintain 10% buffer, bank all else </w:t>
+              <w:t xml:space="preserve">Preserve </w:t>
+            </w:r>
+            <w:proofErr w:type="gramStart"/>
+            <w:r>
+              <w:t>ag</w:t>
+            </w:r>
+            <w:proofErr w:type="gramEnd"/>
+            <w:r>
+              <w:t xml:space="preserve"> (90% floor), maintain 10% buffer, bank all else </w:t>
             </w:r>
           </w:p>
         </w:tc>
@@ -878,7 +1007,15 @@
               </w:rPr>
             </w:pPr>
             <w:r>
-              <w:t xml:space="preserve">Preserve ag (90% floor), maintain 90% buffer, bank all else </w:t>
+              <w:t xml:space="preserve">Preserve </w:t>
+            </w:r>
+            <w:proofErr w:type="gramStart"/>
+            <w:r>
+              <w:t>ag</w:t>
+            </w:r>
+            <w:proofErr w:type="gramEnd"/>
+            <w:r>
+              <w:t xml:space="preserve"> (90% floor), maintain 90% buffer, bank all else </w:t>
             </w:r>
           </w:p>
         </w:tc>
@@ -984,7 +1121,15 @@
         <w:t xml:space="preserve">. </w:t>
       </w:r>
       <w:r>
-        <w:t xml:space="preserve">I have a culture of preservation is very high prioritized. </w:t>
+        <w:t xml:space="preserve">I have a culture of </w:t>
+      </w:r>
+      <w:proofErr w:type="gramStart"/>
+      <w:r>
+        <w:t>preservation</w:t>
+      </w:r>
+      <w:proofErr w:type="gramEnd"/>
+      <w:r>
+        <w:t xml:space="preserve"> is very high prioritized. </w:t>
       </w:r>
       <w:r>
         <w:t>Like p10 said, f</w:t>
@@ -1017,7 +1162,15 @@
         <w:t>Sa</w:t>
       </w:r>
       <w:r>
-        <w:t>me as Upper UT/WY [[played by the same collaborator]]</w:t>
+        <w:t>me as Upper UT/</w:t>
+      </w:r>
+      <w:proofErr w:type="gramStart"/>
+      <w:r>
+        <w:t>WY [[</w:t>
+      </w:r>
+      <w:proofErr w:type="gramEnd"/>
+      <w:r>
+        <w:t>played by the same collaborator]]</w:t>
       </w:r>
     </w:p>
     <w:p>
@@ -1046,8 +1199,47 @@
       <w:r>
         <w:t xml:space="preserve">. </w:t>
       </w:r>
-      <w:r>
-        <w:t>that Ag say 100%, but I’m not an actual water users. Is this I am seeing 10% above average or 10% above maximum? I want to maintain 100% of last years output. I’m not willing to negotiate anything else.</w:t>
+      <w:proofErr w:type="gramStart"/>
+      <w:r>
+        <w:t>that</w:t>
+      </w:r>
+      <w:proofErr w:type="gramEnd"/>
+      <w:r>
+        <w:t xml:space="preserve"> Ag </w:t>
+      </w:r>
+      <w:proofErr w:type="gramStart"/>
+      <w:r>
+        <w:t>say</w:t>
+      </w:r>
+      <w:proofErr w:type="gramEnd"/>
+      <w:r>
+        <w:t xml:space="preserve"> 100%, but I’m not an actual water </w:t>
+      </w:r>
+      <w:proofErr w:type="gramStart"/>
+      <w:r>
+        <w:t>users</w:t>
+      </w:r>
+      <w:proofErr w:type="gramEnd"/>
+      <w:r>
+        <w:t xml:space="preserve">. Is this I </w:t>
+      </w:r>
+      <w:proofErr w:type="gramStart"/>
+      <w:r>
+        <w:t>am seeing</w:t>
+      </w:r>
+      <w:proofErr w:type="gramEnd"/>
+      <w:r>
+        <w:t xml:space="preserve"> 10% above average or 10% above maximum? I want to maintain 100% of last </w:t>
+      </w:r>
+      <w:proofErr w:type="spellStart"/>
+      <w:proofErr w:type="gramStart"/>
+      <w:r>
+        <w:t>years</w:t>
+      </w:r>
+      <w:proofErr w:type="spellEnd"/>
+      <w:proofErr w:type="gramEnd"/>
+      <w:r>
+        <w:t xml:space="preserve"> output. I’m not willing to negotiate anything else.</w:t>
       </w:r>
     </w:p>
     <w:p>
@@ -1071,7 +1263,15 @@
         <w:t xml:space="preserve">Lower UT - </w:t>
       </w:r>
       <w:r>
-        <w:t>Same as Cache Valley [[played by the same collaborator]]</w:t>
+        <w:t xml:space="preserve">Same as Cache </w:t>
+      </w:r>
+      <w:proofErr w:type="gramStart"/>
+      <w:r>
+        <w:t>Valley [[</w:t>
+      </w:r>
+      <w:proofErr w:type="gramEnd"/>
+      <w:r>
+        <w:t>played by the same collaborator]]</w:t>
       </w:r>
     </w:p>
     <w:p>
@@ -1095,13 +1295,7 @@
         <w:t xml:space="preserve">Bank - </w:t>
       </w:r>
       <w:r>
-        <w:t xml:space="preserve">I store the words from the model help guide. In my </w:t>
-      </w:r>
-      <w:r>
-        <w:t>experience,</w:t>
-      </w:r>
-      <w:r>
-        <w:t xml:space="preserve"> $50 million per year. So $50 x 4 years is $200 million. Since most of water is ag. Use, store the water in summer, deliver water in winter so other users do not steal or use.</w:t>
+        <w:t>Since most of water is ag. Use, store the water in summer, deliver water in winter so other users do not steal or use.</w:t>
       </w:r>
       <w:r>
         <w:t xml:space="preserve"> S</w:t>
@@ -1138,11 +1332,53 @@
           <w:color w:val="000000" w:themeColor="text1"/>
         </w:rPr>
       </w:pPr>
+      <w:proofErr w:type="gramStart"/>
       <w:r>
         <w:rPr>
           <w:color w:val="000000" w:themeColor="text1"/>
         </w:rPr>
-        <w:t>Reasoning for Budget : see above</w:t>
+        <w:t>Reasoning</w:t>
+      </w:r>
+      <w:proofErr w:type="gramEnd"/>
+      <w:r>
+        <w:rPr>
+          <w:color w:val="000000" w:themeColor="text1"/>
+        </w:rPr>
+        <w:t xml:space="preserve"> for </w:t>
+      </w:r>
+      <w:proofErr w:type="gramStart"/>
+      <w:r>
+        <w:rPr>
+          <w:color w:val="000000" w:themeColor="text1"/>
+        </w:rPr>
+        <w:t>Budget :</w:t>
+      </w:r>
+      <w:proofErr w:type="gramEnd"/>
+      <w:r>
+        <w:rPr>
+          <w:color w:val="000000" w:themeColor="text1"/>
+        </w:rPr>
+        <w:t xml:space="preserve"> </w:t>
+      </w:r>
+      <w:r>
+        <w:rPr>
+          <w:color w:val="000000" w:themeColor="text1"/>
+        </w:rPr>
+        <w:t xml:space="preserve">I stole the words from the model help guide. In my experience, $50 million per year. </w:t>
+      </w:r>
+      <w:proofErr w:type="gramStart"/>
+      <w:r>
+        <w:rPr>
+          <w:color w:val="000000" w:themeColor="text1"/>
+        </w:rPr>
+        <w:t>So</w:t>
+      </w:r>
+      <w:proofErr w:type="gramEnd"/>
+      <w:r>
+        <w:rPr>
+          <w:color w:val="000000" w:themeColor="text1"/>
+        </w:rPr>
+        <w:t xml:space="preserve"> $50 x 4 years is $200 million.</w:t>
       </w:r>
     </w:p>
     <w:p>
@@ -1159,29 +1395,46 @@
           <w:bCs/>
           <w:color w:val="0000FF"/>
         </w:rPr>
-        <w:t>YEAR 1:</w:t>
-      </w:r>
-      <w:r>
-        <w:tab/>
-      </w:r>
-      <w:r>
-        <w:tab/>
-      </w:r>
+        <w:t>YEAR 1</w:t>
+      </w:r>
+      <w:proofErr w:type="gramStart"/>
       <w:r>
         <w:rPr>
           <w:b/>
           <w:bCs/>
-        </w:rPr>
-        <w:t>12:40 pm</w:t>
-      </w:r>
-    </w:p>
-    <w:p>
-      <w:pPr>
-        <w:spacing w:before="240" w:line="276" w:lineRule="auto"/>
+          <w:color w:val="0000FF"/>
+        </w:rPr>
+        <w:t>:</w:t>
+      </w:r>
+      <w:r>
+        <w:tab/>
+      </w:r>
+      <w:r>
+        <w:tab/>
+      </w:r>
+      <w:r>
         <w:rPr>
           <w:b/>
           <w:bCs/>
         </w:rPr>
+        <w:t>12</w:t>
+      </w:r>
+      <w:proofErr w:type="gramEnd"/>
+      <w:r>
+        <w:rPr>
+          <w:b/>
+          <w:bCs/>
+        </w:rPr>
+        <w:t>:40 pm</w:t>
+      </w:r>
+    </w:p>
+    <w:p>
+      <w:pPr>
+        <w:spacing w:before="240" w:line="276" w:lineRule="auto"/>
+        <w:rPr>
+          <w:b/>
+          <w:bCs/>
+        </w:rPr>
       </w:pPr>
       <w:r>
         <w:rPr>
@@ -1202,7 +1455,14 @@
         <w:rPr>
           <w:color w:val="0000FF"/>
         </w:rPr>
-        <w:t>Natural Flow:</w:t>
+        <w:t>Natural Flow</w:t>
+      </w:r>
+      <w:proofErr w:type="gramStart"/>
+      <w:r>
+        <w:rPr>
+          <w:color w:val="0000FF"/>
+        </w:rPr>
+        <w:t>:</w:t>
       </w:r>
       <w:r>
         <w:tab/>
@@ -1214,8 +1474,23 @@
         <w:rPr>
           <w:color w:val="0000FF"/>
         </w:rPr>
-        <w:t>1.27 maf</w:t>
-      </w:r>
+        <w:t>1.27</w:t>
+      </w:r>
+      <w:proofErr w:type="gramEnd"/>
+      <w:r>
+        <w:rPr>
+          <w:color w:val="0000FF"/>
+        </w:rPr>
+        <w:t xml:space="preserve"> </w:t>
+      </w:r>
+      <w:proofErr w:type="spellStart"/>
+      <w:r>
+        <w:rPr>
+          <w:color w:val="0000FF"/>
+        </w:rPr>
+        <w:t>maf</w:t>
+      </w:r>
+      <w:proofErr w:type="spellEnd"/>
       <w:r>
         <w:tab/>
       </w:r>
@@ -1307,17 +1582,36 @@
         <w:spacing w:before="240" w:line="276" w:lineRule="auto"/>
       </w:pPr>
       <w:r>
+        <w:t xml:space="preserve">P10: </w:t>
+      </w:r>
+      <w:r>
+        <w:t xml:space="preserve">In recent years in the </w:t>
+      </w:r>
+      <w:proofErr w:type="spellStart"/>
+      <w:r>
+        <w:t>Coloardo</w:t>
+      </w:r>
+      <w:proofErr w:type="spellEnd"/>
+      <w:r>
+        <w:t xml:space="preserve"> River we said $400 to $500 per acre foot. Reclamation was not keen on this, but people justified what they had to pay to buy hay.</w:t>
+      </w:r>
+      <w:r>
+        <w:t xml:space="preserve"> </w:t>
+      </w:r>
+      <w:r>
+        <w:t xml:space="preserve">For the sake of argument </w:t>
+      </w:r>
+      <w:r>
         <w:lastRenderedPageBreak/>
-        <w:t xml:space="preserve">P10: </w:t>
-      </w:r>
-      <w:r>
-        <w:t>In recent years in the Coloardo River we said $400 to $500 per acre foot. Reclamation was not keen on this, but people justified what they had to pay to buy hay.</w:t>
-      </w:r>
-      <w:r>
-        <w:t xml:space="preserve"> </w:t>
-      </w:r>
-      <w:r>
-        <w:t>For the sake of argument 400 per acre ft that would leave us 41 million for the year. I'm imagining there would be different price for industrial users if they would foreg</w:t>
+        <w:t xml:space="preserve">400 per acre ft that would leave us 41 million for the year. I'm imagining there would be different </w:t>
+      </w:r>
+      <w:proofErr w:type="gramStart"/>
+      <w:r>
+        <w:t>price</w:t>
+      </w:r>
+      <w:proofErr w:type="gramEnd"/>
+      <w:r>
+        <w:t xml:space="preserve"> for industrial users if they would foreg</w:t>
       </w:r>
       <w:r>
         <w:t>o,</w:t>
@@ -1347,8 +1641,21 @@
       <w:r>
         <w:t xml:space="preserve"> </w:t>
       </w:r>
-      <w:r>
-        <w:t>IS there much use for industrial users in the upper stream or is it mostly ag?</w:t>
+      <w:proofErr w:type="gramStart"/>
+      <w:r>
+        <w:t>IS</w:t>
+      </w:r>
+      <w:proofErr w:type="gramEnd"/>
+      <w:r>
+        <w:t xml:space="preserve"> there much use for industrial users in the upper stream or is it mostly </w:t>
+      </w:r>
+      <w:proofErr w:type="gramStart"/>
+      <w:r>
+        <w:t>ag</w:t>
+      </w:r>
+      <w:proofErr w:type="gramEnd"/>
+      <w:r>
+        <w:t>?</w:t>
       </w:r>
     </w:p>
     <w:p>
@@ -1369,8 +1676,18 @@
       <w:r>
         <w:t xml:space="preserve"> </w:t>
       </w:r>
-      <w:r>
-        <w:t>Lets , do $500 per acre feet and see what that does.</w:t>
+      <w:proofErr w:type="spellStart"/>
+      <w:proofErr w:type="gramStart"/>
+      <w:r>
+        <w:t>Lets</w:t>
+      </w:r>
+      <w:proofErr w:type="spellEnd"/>
+      <w:r>
+        <w:t xml:space="preserve"> ,</w:t>
+      </w:r>
+      <w:proofErr w:type="gramEnd"/>
+      <w:r>
+        <w:t xml:space="preserve"> do $500 per acre feet and see what that does.</w:t>
       </w:r>
     </w:p>
     <w:p>
@@ -1404,16 +1721,37 @@
         <w:t xml:space="preserve"> year people say oh Bob got a check</w:t>
       </w:r>
       <w:r>
-        <w:t xml:space="preserve"> from the government</w:t>
-      </w:r>
-      <w:r>
-        <w:t>, I want to get a part of that.</w:t>
+        <w:t xml:space="preserve"> from the </w:t>
+      </w:r>
+      <w:proofErr w:type="gramStart"/>
+      <w:r>
+        <w:t>government</w:t>
+      </w:r>
+      <w:r>
+        <w:t>,</w:t>
+      </w:r>
+      <w:proofErr w:type="gramEnd"/>
+      <w:r>
+        <w:t xml:space="preserve"> I want to get a part of that.</w:t>
       </w:r>
       <w:r>
         <w:t xml:space="preserve"> </w:t>
       </w:r>
-      <w:r>
-        <w:t>So people buy in more the 2</w:t>
+      <w:proofErr w:type="gramStart"/>
+      <w:r>
+        <w:t>So</w:t>
+      </w:r>
+      <w:proofErr w:type="gramEnd"/>
+      <w:r>
+        <w:t xml:space="preserve"> people buy </w:t>
+      </w:r>
+      <w:proofErr w:type="gramStart"/>
+      <w:r>
+        <w:t>in more</w:t>
+      </w:r>
+      <w:proofErr w:type="gramEnd"/>
+      <w:r>
+        <w:t xml:space="preserve"> the 2</w:t>
       </w:r>
       <w:r>
         <w:rPr>
@@ -1422,7 +1760,15 @@
         <w:t>nd</w:t>
       </w:r>
       <w:r>
-        <w:t xml:space="preserve"> year when they realize its rea</w:t>
+        <w:t xml:space="preserve"> year when they realize </w:t>
+      </w:r>
+      <w:proofErr w:type="gramStart"/>
+      <w:r>
+        <w:t>its</w:t>
+      </w:r>
+      <w:proofErr w:type="gramEnd"/>
+      <w:r>
+        <w:t xml:space="preserve"> rea</w:t>
       </w:r>
       <w:r>
         <w:t>l.</w:t>
@@ -1438,7 +1784,15 @@
         <w:spacing w:before="240" w:line="276" w:lineRule="auto"/>
       </w:pPr>
       <w:r>
-        <w:t>$500 per arcre foot, reference to System Conservation Pilot Program.</w:t>
+        <w:t xml:space="preserve">$500 per </w:t>
+      </w:r>
+      <w:proofErr w:type="spellStart"/>
+      <w:r>
+        <w:t>arcre</w:t>
+      </w:r>
+      <w:proofErr w:type="spellEnd"/>
+      <w:r>
+        <w:t xml:space="preserve"> foot, reference to System Conservation Pilot Program.</w:t>
       </w:r>
     </w:p>
     <w:p>
@@ -1462,8 +1816,13 @@
         </w:numPr>
         <w:spacing w:before="240" w:line="276" w:lineRule="auto"/>
       </w:pPr>
-      <w:r>
-        <w:t>So for the first year, do same as up above for Upper Wyoming. 90% consume.</w:t>
+      <w:proofErr w:type="gramStart"/>
+      <w:r>
+        <w:t>So</w:t>
+      </w:r>
+      <w:proofErr w:type="gramEnd"/>
+      <w:r>
+        <w:t xml:space="preserve"> for the first year, do same as up above for Upper Wyoming. 90% consume.</w:t>
       </w:r>
     </w:p>
     <w:p>
@@ -1501,13 +1860,37 @@
         <w:t xml:space="preserve">Bank: </w:t>
       </w:r>
       <w:r>
-        <w:t xml:space="preserve">This is below bear lake right? So if </w:t>
+        <w:t xml:space="preserve">This is below bear </w:t>
+      </w:r>
+      <w:proofErr w:type="gramStart"/>
+      <w:r>
+        <w:t>lake</w:t>
+      </w:r>
+      <w:proofErr w:type="gramEnd"/>
+      <w:r>
+        <w:t xml:space="preserve"> right? </w:t>
+      </w:r>
+      <w:proofErr w:type="gramStart"/>
+      <w:r>
+        <w:t>So</w:t>
+      </w:r>
+      <w:proofErr w:type="gramEnd"/>
+      <w:r>
+        <w:t xml:space="preserve"> if </w:t>
       </w:r>
       <w:r>
         <w:t>I a</w:t>
       </w:r>
       <w:r>
-        <w:t xml:space="preserve">m the bank holder in bear lake, I’m assuming I have to pay </w:t>
+        <w:t xml:space="preserve">m the bank holder in bear lake, I’m assuming I </w:t>
+      </w:r>
+      <w:proofErr w:type="gramStart"/>
+      <w:r>
+        <w:t>have to</w:t>
+      </w:r>
+      <w:proofErr w:type="gramEnd"/>
+      <w:r>
+        <w:t xml:space="preserve"> pay </w:t>
       </w:r>
       <w:r>
         <w:t>operations and maintenance (O&amp;M) on storage in reservoir to the owner of the reservoir</w:t>
@@ -1525,7 +1908,15 @@
         <w:t xml:space="preserve"> </w:t>
       </w:r>
       <w:r>
-        <w:t>And there is evaporation so I have less water. It makes our bank. I will pay you less water for your water because I have these other expensive things to keep in min</w:t>
+        <w:t xml:space="preserve">And there is </w:t>
+      </w:r>
+      <w:proofErr w:type="gramStart"/>
+      <w:r>
+        <w:t>evaporation</w:t>
+      </w:r>
+      <w:proofErr w:type="gramEnd"/>
+      <w:r>
+        <w:t xml:space="preserve"> so I have less water. It makes our bank. I will pay you less water for your water because I have these other expensive things to keep in min</w:t>
       </w:r>
       <w:r>
         <w:t>d.</w:t>
@@ -1571,8 +1962,13 @@
         </w:numPr>
         <w:spacing w:before="240" w:line="276" w:lineRule="auto"/>
       </w:pPr>
-      <w:r>
-        <w:t>So I said I would do 90% [consumption]</w:t>
+      <w:proofErr w:type="gramStart"/>
+      <w:r>
+        <w:t>So</w:t>
+      </w:r>
+      <w:proofErr w:type="gramEnd"/>
+      <w:r>
+        <w:t xml:space="preserve"> I said I would do 90% [consumption]</w:t>
       </w:r>
     </w:p>
     <w:p>
@@ -1591,7 +1987,23 @@
         <w:t xml:space="preserve"> </w:t>
       </w:r>
       <w:r>
-        <w:t>Yeah - I guess this will be kinda of arbitrary,  keep 10% remainder for me.</w:t>
+        <w:t xml:space="preserve">Yeah - I guess this will be </w:t>
+      </w:r>
+      <w:proofErr w:type="spellStart"/>
+      <w:r>
+        <w:t>kinda</w:t>
+      </w:r>
+      <w:proofErr w:type="spellEnd"/>
+      <w:r>
+        <w:t xml:space="preserve"> of </w:t>
+      </w:r>
+      <w:proofErr w:type="gramStart"/>
+      <w:r>
+        <w:t>arbitrary,  keep</w:t>
+      </w:r>
+      <w:proofErr w:type="gramEnd"/>
+      <w:r>
+        <w:t xml:space="preserve"> 10% remainder for me.</w:t>
       </w:r>
     </w:p>
     <w:p>
@@ -1617,7 +2029,23 @@
         <w:spacing w:before="240" w:line="276" w:lineRule="auto"/>
       </w:pPr>
       <w:r>
-        <w:t>To negotiate this price, does the $500 per acre-feet is right.</w:t>
+        <w:t xml:space="preserve">To negotiate this price, does the $500 per </w:t>
+      </w:r>
+      <w:proofErr w:type="gramStart"/>
+      <w:r>
+        <w:t>acre-feet</w:t>
+      </w:r>
+      <w:proofErr w:type="gramEnd"/>
+      <w:r>
+        <w:t xml:space="preserve"> </w:t>
+      </w:r>
+      <w:proofErr w:type="gramStart"/>
+      <w:r>
+        <w:t>is</w:t>
+      </w:r>
+      <w:proofErr w:type="gramEnd"/>
+      <w:r>
+        <w:t xml:space="preserve"> right.</w:t>
       </w:r>
     </w:p>
     <w:p>
@@ -1630,13 +2058,34 @@
         <w:spacing w:before="240" w:line="276" w:lineRule="auto"/>
       </w:pPr>
       <w:r>
-        <w:t xml:space="preserve">Bank: so Cache Valley doesn’t have storage in Bear Lake. </w:t>
+        <w:t xml:space="preserve">Bank: </w:t>
+      </w:r>
+      <w:proofErr w:type="gramStart"/>
+      <w:r>
+        <w:t>so</w:t>
+      </w:r>
+      <w:proofErr w:type="gramEnd"/>
+      <w:r>
+        <w:t xml:space="preserve"> Cache Valley doesn’t have storage in Bear Lake. </w:t>
       </w:r>
       <w:r>
         <w:t xml:space="preserve"> </w:t>
       </w:r>
-      <w:r>
-        <w:t>Um.. Some of what we have learned in the Colorado River basin, what real estate agents always say, location, location, location, you’re lower in the Basin, more of your water will get to Bear Lake. So $500 is. What kind of crops?</w:t>
+      <w:proofErr w:type="gramStart"/>
+      <w:r>
+        <w:t>Um..</w:t>
+      </w:r>
+      <w:proofErr w:type="gramEnd"/>
+      <w:r>
+        <w:t xml:space="preserve"> Some of what we have learned in the Colorado River basin, what real estate agents always say, location, location, location, you’re lower in the Basin, more of your water will get to Bear Lake. </w:t>
+      </w:r>
+      <w:proofErr w:type="gramStart"/>
+      <w:r>
+        <w:t>So</w:t>
+      </w:r>
+      <w:proofErr w:type="gramEnd"/>
+      <w:r>
+        <w:t xml:space="preserve"> $500 is. What kind of crops?</w:t>
       </w:r>
     </w:p>
     <w:p>
@@ -1665,7 +2114,15 @@
         <w:spacing w:before="240" w:line="276" w:lineRule="auto"/>
       </w:pPr>
       <w:r>
-        <w:t>$500 all good, sold!</w:t>
+        <w:t>$500 all good,</w:t>
+      </w:r>
+      <w:proofErr w:type="gramStart"/>
+      <w:r>
+        <w:t xml:space="preserve"> sold</w:t>
+      </w:r>
+      <w:proofErr w:type="gramEnd"/>
+      <w:r>
+        <w:t>!</w:t>
       </w:r>
     </w:p>
     <w:p>
@@ -1707,14 +2164,23 @@
         <w:t xml:space="preserve">P11: </w:t>
       </w:r>
       <w:r>
-        <w:t xml:space="preserve">I had said, I would consume all, but maybe that is kind of boring. I want to see what happens if I play the part, take a conservative decision, I always have water for next year. </w:t>
-      </w:r>
-      <w:r>
-        <w:lastRenderedPageBreak/>
-        <w:t>Conserve a lot instead of bank a lot. I still want something to work with</w:t>
-      </w:r>
-      <w:r>
-        <w:t xml:space="preserve"> so I won’t maintain 100% ag.</w:t>
+        <w:t xml:space="preserve">I had said, I would consume all, but maybe that is kind of boring. I want to see what happens if I play the part, take a conservative decision, I always have water for next year. Conserve a lot instead of bank a lot. I still want something to work </w:t>
+      </w:r>
+      <w:proofErr w:type="gramStart"/>
+      <w:r>
+        <w:t>with</w:t>
+      </w:r>
+      <w:proofErr w:type="gramEnd"/>
+      <w:r>
+        <w:t xml:space="preserve"> so I won’t maintain 100% </w:t>
+      </w:r>
+      <w:proofErr w:type="gramStart"/>
+      <w:r>
+        <w:t>ag</w:t>
+      </w:r>
+      <w:proofErr w:type="gramEnd"/>
+      <w:r>
+        <w:t>.</w:t>
       </w:r>
     </w:p>
     <w:p>
@@ -1726,8 +2192,14 @@
         </w:numPr>
         <w:spacing w:before="240" w:line="276" w:lineRule="auto"/>
       </w:pPr>
-      <w:r>
-        <w:t>So I’m going to switch it up, same as above, 90% again. But I will only sell 10% of the conserved water.</w:t>
+      <w:proofErr w:type="gramStart"/>
+      <w:r>
+        <w:lastRenderedPageBreak/>
+        <w:t>So</w:t>
+      </w:r>
+      <w:proofErr w:type="gramEnd"/>
+      <w:r>
+        <w:t xml:space="preserve"> I’m going to switch it up, same as above, 90% again. But I will only sell 10% of the conserved water.</w:t>
       </w:r>
     </w:p>
     <w:p>
@@ -1740,7 +2212,11 @@
         <w:spacing w:before="240" w:line="276" w:lineRule="auto"/>
       </w:pPr>
       <w:r>
-        <w:t xml:space="preserve">P11: </w:t>
+        <w:t>P11</w:t>
+      </w:r>
+      <w:proofErr w:type="gramStart"/>
+      <w:r>
+        <w:t xml:space="preserve">: </w:t>
       </w:r>
       <w:r>
         <w:t xml:space="preserve"> </w:t>
@@ -1748,8 +2224,17 @@
       <w:r>
         <w:t>Bank</w:t>
       </w:r>
-      <w:r>
-        <w:t>, how do you feel about a $1000 per acre-foot?</w:t>
+      <w:proofErr w:type="gramEnd"/>
+      <w:r>
+        <w:t xml:space="preserve">, how do you feel about </w:t>
+      </w:r>
+      <w:proofErr w:type="gramStart"/>
+      <w:r>
+        <w:t>a $</w:t>
+      </w:r>
+      <w:proofErr w:type="gramEnd"/>
+      <w:r>
+        <w:t>1000 per acre-foot?</w:t>
       </w:r>
     </w:p>
     <w:p>
@@ -1821,7 +2306,15 @@
         <w:t xml:space="preserve">Strategy was - </w:t>
       </w:r>
       <w:r>
-        <w:t>I am assuming this is a voluntary program – not mandatory, we will take what water we can get, with no benchmark or targert amount. Feeling out the system, seeing what</w:t>
+        <w:t xml:space="preserve">I am assuming this is a voluntary program – not mandatory, we will take what water we can get, with no benchmark or </w:t>
+      </w:r>
+      <w:proofErr w:type="spellStart"/>
+      <w:r>
+        <w:t>targert</w:t>
+      </w:r>
+      <w:proofErr w:type="spellEnd"/>
+      <w:r>
+        <w:t xml:space="preserve"> amount. Feeling out the system, seeing what</w:t>
       </w:r>
       <w:r>
         <w:t xml:space="preserve"> the </w:t>
@@ -2007,8 +2500,16 @@
         <w:rPr>
           <w:color w:val="0000FF"/>
         </w:rPr>
-        <w:t>1.4 maf</w:t>
-      </w:r>
+        <w:t xml:space="preserve">1.4 </w:t>
+      </w:r>
+      <w:proofErr w:type="spellStart"/>
+      <w:r>
+        <w:rPr>
+          <w:color w:val="0000FF"/>
+        </w:rPr>
+        <w:t>maf</w:t>
+      </w:r>
+      <w:proofErr w:type="spellEnd"/>
       <w:r>
         <w:tab/>
       </w:r>
@@ -2052,8 +2553,13 @@
       <w:r>
         <w:t xml:space="preserve">P11: </w:t>
       </w:r>
-      <w:r>
-        <w:t>So this year we have higher natural flow?</w:t>
+      <w:proofErr w:type="gramStart"/>
+      <w:r>
+        <w:t>So</w:t>
+      </w:r>
+      <w:proofErr w:type="gramEnd"/>
+      <w:r>
+        <w:t xml:space="preserve"> this year we have higher natural flow?</w:t>
       </w:r>
     </w:p>
     <w:p>
@@ -2107,7 +2613,23 @@
         <w:t>ause</w:t>
       </w:r>
       <w:r>
-        <w:t xml:space="preserve"> mother nature provided some of that water? If there are higher flows there is more precip.</w:t>
+        <w:t xml:space="preserve"> mother nature provided some of that water? If there are higher </w:t>
+      </w:r>
+      <w:proofErr w:type="gramStart"/>
+      <w:r>
+        <w:t>flows</w:t>
+      </w:r>
+      <w:proofErr w:type="gramEnd"/>
+      <w:r>
+        <w:t xml:space="preserve"> there is more </w:t>
+      </w:r>
+      <w:proofErr w:type="spellStart"/>
+      <w:r>
+        <w:t>precip</w:t>
+      </w:r>
+      <w:proofErr w:type="spellEnd"/>
+      <w:r>
+        <w:t>.</w:t>
       </w:r>
     </w:p>
     <w:p>
@@ -2187,8 +2709,13 @@
         </w:numPr>
         <w:spacing w:before="240" w:line="276" w:lineRule="auto"/>
       </w:pPr>
-      <w:r>
-        <w:t>So if have more precipitation, more of that water goes to the bank.</w:t>
+      <w:proofErr w:type="gramStart"/>
+      <w:r>
+        <w:t>So</w:t>
+      </w:r>
+      <w:proofErr w:type="gramEnd"/>
+      <w:r>
+        <w:t xml:space="preserve"> if have more precipitation, more of that water goes to the bank.</w:t>
       </w:r>
     </w:p>
     <w:p>
@@ -2201,14 +2728,52 @@
         <w:spacing w:before="240" w:line="276" w:lineRule="auto"/>
       </w:pPr>
       <w:r>
-        <w:lastRenderedPageBreak/>
-        <w:t>Bank: So maybe this is set up as a year-to-year basis, we have more water going to the bank. So we pay less this year</w:t>
+        <w:t xml:space="preserve">Bank: So maybe this is set up </w:t>
+      </w:r>
+      <w:proofErr w:type="gramStart"/>
+      <w:r>
+        <w:t>as</w:t>
+      </w:r>
+      <w:proofErr w:type="gramEnd"/>
+      <w:r>
+        <w:t xml:space="preserve"> a year-to-year basis, we have more water going to the bank. </w:t>
+      </w:r>
+      <w:proofErr w:type="gramStart"/>
+      <w:r>
+        <w:t>So</w:t>
+      </w:r>
+      <w:proofErr w:type="gramEnd"/>
+      <w:r>
+        <w:t xml:space="preserve"> we pay less this year</w:t>
       </w:r>
       <w:r>
         <w:t xml:space="preserve">. </w:t>
       </w:r>
-      <w:r>
-        <w:t>Its not gonna cost you as much to replace cause mother nature helped out.</w:t>
+      <w:proofErr w:type="spellStart"/>
+      <w:proofErr w:type="gramStart"/>
+      <w:r>
+        <w:t>Its</w:t>
+      </w:r>
+      <w:proofErr w:type="spellEnd"/>
+      <w:proofErr w:type="gramEnd"/>
+      <w:r>
+        <w:t xml:space="preserve"> not </w:t>
+      </w:r>
+      <w:proofErr w:type="spellStart"/>
+      <w:r>
+        <w:t>gonna</w:t>
+      </w:r>
+      <w:proofErr w:type="spellEnd"/>
+      <w:r>
+        <w:t xml:space="preserve"> cost you as much to replace cause mother nature </w:t>
+      </w:r>
+      <w:proofErr w:type="gramStart"/>
+      <w:r>
+        <w:t>helped out</w:t>
+      </w:r>
+      <w:proofErr w:type="gramEnd"/>
+      <w:r>
+        <w:t>.</w:t>
       </w:r>
     </w:p>
     <w:p>
@@ -2221,6 +2786,7 @@
         <w:spacing w:before="240" w:line="276" w:lineRule="auto"/>
       </w:pPr>
       <w:r>
+        <w:lastRenderedPageBreak/>
         <w:t>AU1</w:t>
       </w:r>
       <w:r>
@@ -2270,8 +2836,23 @@
         </w:numPr>
         <w:spacing w:before="240" w:line="276" w:lineRule="auto"/>
       </w:pPr>
-      <w:r>
-        <w:t xml:space="preserve">It can’t go towards the bank? [last years water] </w:t>
+      <w:proofErr w:type="gramStart"/>
+      <w:r>
+        <w:t>It can’t</w:t>
+      </w:r>
+      <w:proofErr w:type="gramEnd"/>
+      <w:r>
+        <w:t xml:space="preserve"> go towards the bank? [last </w:t>
+      </w:r>
+      <w:proofErr w:type="spellStart"/>
+      <w:proofErr w:type="gramStart"/>
+      <w:r>
+        <w:t>years</w:t>
+      </w:r>
+      <w:proofErr w:type="spellEnd"/>
+      <w:proofErr w:type="gramEnd"/>
+      <w:r>
+        <w:t xml:space="preserve"> water] </w:t>
       </w:r>
     </w:p>
     <w:p>
@@ -2287,7 +2868,15 @@
         <w:t>P10</w:t>
       </w:r>
       <w:r>
-        <w:t>: Maybe thats a good strategy [save water and sell next year from saved water]</w:t>
+        <w:t xml:space="preserve">: Maybe </w:t>
+      </w:r>
+      <w:proofErr w:type="spellStart"/>
+      <w:r>
+        <w:t>thats</w:t>
+      </w:r>
+      <w:proofErr w:type="spellEnd"/>
+      <w:r>
+        <w:t xml:space="preserve"> a good strategy [save water and sell next year from saved water]</w:t>
       </w:r>
       <w:r>
         <w:t>.</w:t>
@@ -2305,8 +2894,13 @@
       <w:r>
         <w:t xml:space="preserve">AU1: </w:t>
       </w:r>
-      <w:r>
-        <w:t>Lets just leave it as it</w:t>
+      <w:proofErr w:type="spellStart"/>
+      <w:r>
+        <w:t>Lets</w:t>
+      </w:r>
+      <w:proofErr w:type="spellEnd"/>
+      <w:r>
+        <w:t xml:space="preserve"> just leave it as it</w:t>
       </w:r>
       <w:r>
         <w:t xml:space="preserve">, </w:t>
@@ -2327,8 +2921,15 @@
         </w:numPr>
         <w:spacing w:before="240" w:line="276" w:lineRule="auto"/>
       </w:pPr>
-      <w:r>
-        <w:t>Lets do same as last year, 50%/50% to personal account and the bank</w:t>
+      <w:proofErr w:type="spellStart"/>
+      <w:proofErr w:type="gramStart"/>
+      <w:r>
+        <w:t>Lets</w:t>
+      </w:r>
+      <w:proofErr w:type="spellEnd"/>
+      <w:proofErr w:type="gramEnd"/>
+      <w:r>
+        <w:t xml:space="preserve"> do same as last year, 50%/50% to personal account and the bank</w:t>
       </w:r>
     </w:p>
     <w:p>
@@ -2360,7 +2961,15 @@
         <w:spacing w:before="240" w:line="276" w:lineRule="auto"/>
       </w:pPr>
       <w:r>
-        <w:t>Bank: Sticking with above, dropping the price because we have higher natural flow. So drop a $100 to $350 per acre-foot?</w:t>
+        <w:t xml:space="preserve">Bank: Sticking with above, dropping the price because we have higher natural flow. </w:t>
+      </w:r>
+      <w:proofErr w:type="gramStart"/>
+      <w:r>
+        <w:t>So</w:t>
+      </w:r>
+      <w:proofErr w:type="gramEnd"/>
+      <w:r>
+        <w:t xml:space="preserve"> drop a $100 to $350 per acre-foot?</w:t>
       </w:r>
     </w:p>
     <w:p>
@@ -2540,8 +3149,21 @@
         <w:t>, what</w:t>
       </w:r>
       <w:r>
-        <w:t xml:space="preserve"> are you gonna do with is</w:t>
-      </w:r>
+        <w:t xml:space="preserve"> are you </w:t>
+      </w:r>
+      <w:proofErr w:type="spellStart"/>
+      <w:r>
+        <w:t>gonna</w:t>
+      </w:r>
+      <w:proofErr w:type="spellEnd"/>
+      <w:r>
+        <w:t xml:space="preserve"> do with </w:t>
+      </w:r>
+      <w:proofErr w:type="gramStart"/>
+      <w:r>
+        <w:t>is</w:t>
+      </w:r>
+      <w:proofErr w:type="gramEnd"/>
       <w:r>
         <w:t>?</w:t>
       </w:r>
@@ -2559,7 +3181,15 @@
         <w:t>Bank</w:t>
       </w:r>
       <w:r>
-        <w:t>: I have to pay industrial users</w:t>
+        <w:t xml:space="preserve">: I </w:t>
+      </w:r>
+      <w:proofErr w:type="gramStart"/>
+      <w:r>
+        <w:t>have to</w:t>
+      </w:r>
+      <w:proofErr w:type="gramEnd"/>
+      <w:r>
+        <w:t xml:space="preserve"> pay industrial users</w:t>
       </w:r>
     </w:p>
     <w:p>
@@ -2597,7 +3227,15 @@
         <w:t>,</w:t>
       </w:r>
       <w:r>
-        <w:t xml:space="preserve"> but you gotta think about that</w:t>
+        <w:t xml:space="preserve"> but you </w:t>
+      </w:r>
+      <w:proofErr w:type="spellStart"/>
+      <w:r>
+        <w:t>gotta</w:t>
+      </w:r>
+      <w:proofErr w:type="spellEnd"/>
+      <w:r>
+        <w:t xml:space="preserve"> think about that</w:t>
       </w:r>
       <w:r>
         <w:t>.</w:t>
@@ -2616,11 +3254,24 @@
         <w:t xml:space="preserve">P11: </w:t>
       </w:r>
       <w:r>
-        <w:t>It’s interesting, we could all ban</w:t>
+        <w:t xml:space="preserve">It’s interesting, we could </w:t>
+      </w:r>
+      <w:proofErr w:type="gramStart"/>
+      <w:r>
+        <w:t>all</w:t>
+      </w:r>
+      <w:proofErr w:type="gramEnd"/>
+      <w:r>
+        <w:t xml:space="preserve"> </w:t>
+      </w:r>
+      <w:proofErr w:type="gramStart"/>
+      <w:r>
+        <w:t>ban</w:t>
       </w:r>
       <w:r>
         <w:t>k</w:t>
       </w:r>
+      <w:proofErr w:type="gramEnd"/>
       <w:r>
         <w:t xml:space="preserve"> together to maximize how we get water to </w:t>
       </w:r>
@@ -2663,7 +3314,15 @@
         <w:t>AU1</w:t>
       </w:r>
       <w:r>
-        <w:t>: Especially as we move to lower Utah, growing, less agriculture, more urban. So the price is going up. So as time goes on, the bank will have to pay more money to offset the [urban] user.</w:t>
+        <w:t xml:space="preserve">: Especially as we move to lower Utah, growing, less agriculture, more urban. </w:t>
+      </w:r>
+      <w:proofErr w:type="gramStart"/>
+      <w:r>
+        <w:t>So</w:t>
+      </w:r>
+      <w:proofErr w:type="gramEnd"/>
+      <w:r>
+        <w:t xml:space="preserve"> the price is going up. So as time goes on, the bank will have to pay more money to offset the [urban] user.</w:t>
       </w:r>
       <w:r>
         <w:t xml:space="preserve"> </w:t>
@@ -2681,7 +3340,15 @@
         <w:t>icipal</w:t>
       </w:r>
       <w:r>
-        <w:t xml:space="preserve"> water is worth 1200$. The bank is gonna have to u</w:t>
+        <w:t xml:space="preserve"> water is worth 1200$. The bank is </w:t>
+      </w:r>
+      <w:proofErr w:type="spellStart"/>
+      <w:r>
+        <w:t>gonna</w:t>
+      </w:r>
+      <w:proofErr w:type="spellEnd"/>
+      <w:r>
+        <w:t xml:space="preserve"> have to u</w:t>
       </w:r>
       <w:r>
         <w:t>s</w:t>
@@ -2703,13 +3370,37 @@
         <w:t xml:space="preserve">P11: </w:t>
       </w:r>
       <w:r>
-        <w:t>How many years in the future? Can I save now and save in the future?</w:t>
+        <w:t xml:space="preserve">How many years </w:t>
+      </w:r>
+      <w:proofErr w:type="gramStart"/>
+      <w:r>
+        <w:t>in</w:t>
+      </w:r>
+      <w:proofErr w:type="gramEnd"/>
+      <w:r>
+        <w:t xml:space="preserve"> the future? Can I save now and save in the future?</w:t>
       </w:r>
       <w:r>
         <w:t xml:space="preserve"> </w:t>
       </w:r>
       <w:r>
-        <w:t>If I bank this year can I use that water in 10 years or have other things happened? We’re only looking at 4 years.</w:t>
+        <w:t xml:space="preserve">If </w:t>
+      </w:r>
+      <w:proofErr w:type="gramStart"/>
+      <w:r>
+        <w:t>I bank</w:t>
+      </w:r>
+      <w:proofErr w:type="gramEnd"/>
+      <w:r>
+        <w:t xml:space="preserve"> this </w:t>
+      </w:r>
+      <w:proofErr w:type="gramStart"/>
+      <w:r>
+        <w:t>year</w:t>
+      </w:r>
+      <w:proofErr w:type="gramEnd"/>
+      <w:r>
+        <w:t xml:space="preserve"> can I use that water in 10 years or have other things happened? We’re only looking at 4 years.</w:t>
       </w:r>
     </w:p>
     <w:p>
@@ -2757,7 +3448,17 @@
         <w:t xml:space="preserve">So different scenarios to play out. </w:t>
       </w:r>
       <w:r>
-        <w:t>[Its a very different situation]</w:t>
+        <w:t>[</w:t>
+      </w:r>
+      <w:proofErr w:type="spellStart"/>
+      <w:proofErr w:type="gramStart"/>
+      <w:r>
+        <w:t>Its</w:t>
+      </w:r>
+      <w:proofErr w:type="spellEnd"/>
+      <w:proofErr w:type="gramEnd"/>
+      <w:r>
+        <w:t xml:space="preserve"> a very different situation]</w:t>
       </w:r>
     </w:p>
     <w:p>
@@ -2790,8 +3491,13 @@
       <w:r>
         <w:t xml:space="preserve">P11: I realize I can increase my yield this year. </w:t>
       </w:r>
-      <w:r>
-        <w:t xml:space="preserve">So I am thinking, the Great Salt Lake Strike Team is looking for 125,000 acre-feet </w:t>
+      <w:proofErr w:type="gramStart"/>
+      <w:r>
+        <w:t>So</w:t>
+      </w:r>
+      <w:proofErr w:type="gramEnd"/>
+      <w:r>
+        <w:t xml:space="preserve"> I am thinking, the Great Salt Lake Strike Team is looking for 125,000 acre-feet </w:t>
       </w:r>
       <w:r>
         <w:t>a year to lake to see any kind of change</w:t>
@@ -2810,8 +3516,29 @@
         <w:spacing w:before="240" w:line="276" w:lineRule="auto"/>
       </w:pPr>
       <w:r>
-        <w:t>I have to do what my people, they are all yelling at me</w:t>
-      </w:r>
+        <w:t xml:space="preserve">I </w:t>
+      </w:r>
+      <w:proofErr w:type="gramStart"/>
+      <w:r>
+        <w:t>have to</w:t>
+      </w:r>
+      <w:proofErr w:type="gramEnd"/>
+      <w:r>
+        <w:t xml:space="preserve"> do what my </w:t>
+      </w:r>
+      <w:proofErr w:type="gramStart"/>
+      <w:r>
+        <w:t>people</w:t>
+      </w:r>
+      <w:proofErr w:type="gramEnd"/>
+      <w:r>
+        <w:t xml:space="preserve">, they are all yelling at </w:t>
+      </w:r>
+      <w:proofErr w:type="gramStart"/>
+      <w:r>
+        <w:t>me</w:t>
+      </w:r>
+      <w:proofErr w:type="gramEnd"/>
       <w:r>
         <w:t xml:space="preserve"> </w:t>
       </w:r>
@@ -2831,8 +3558,13 @@
         </w:numPr>
         <w:spacing w:before="240" w:line="276" w:lineRule="auto"/>
       </w:pPr>
-      <w:r>
-        <w:t>So I don’t know. Not changing Ag practices but banking more water this year.  Same 90% to consume.</w:t>
+      <w:proofErr w:type="gramStart"/>
+      <w:r>
+        <w:t>So</w:t>
+      </w:r>
+      <w:proofErr w:type="gramEnd"/>
+      <w:r>
+        <w:t xml:space="preserve"> I don’t know. Not changing Ag practices but banking more water this year.  Same 90% to consume.</w:t>
       </w:r>
       <w:r>
         <w:t xml:space="preserve"> </w:t>
@@ -2866,7 +3598,15 @@
         <w:t>argument</w:t>
       </w:r>
       <w:r>
-        <w:t>. I want to get the most of the water. Give me the first number.</w:t>
+        <w:t xml:space="preserve">. I want to get </w:t>
+      </w:r>
+      <w:proofErr w:type="gramStart"/>
+      <w:r>
+        <w:t>the most</w:t>
+      </w:r>
+      <w:proofErr w:type="gramEnd"/>
+      <w:r>
+        <w:t xml:space="preserve"> of the water. Give me the first number.</w:t>
       </w:r>
     </w:p>
     <w:p>
@@ -2891,8 +3631,21 @@
         </w:numPr>
         <w:spacing w:before="240" w:line="276" w:lineRule="auto"/>
       </w:pPr>
-      <w:r>
-        <w:t>Thats pretty good to me.</w:t>
+      <w:proofErr w:type="spellStart"/>
+      <w:r>
+        <w:t>Thats</w:t>
+      </w:r>
+      <w:proofErr w:type="spellEnd"/>
+      <w:r>
+        <w:t xml:space="preserve"> pretty good </w:t>
+      </w:r>
+      <w:proofErr w:type="gramStart"/>
+      <w:r>
+        <w:t>to</w:t>
+      </w:r>
+      <w:proofErr w:type="gramEnd"/>
+      <w:r>
+        <w:t xml:space="preserve"> me.</w:t>
       </w:r>
     </w:p>
     <w:p>
@@ -2950,7 +3703,15 @@
         <w:t xml:space="preserve"> </w:t>
       </w:r>
       <w:r>
-        <w:t>And I want to do my part for the GSL.</w:t>
+        <w:t xml:space="preserve">And I want to do my part for </w:t>
+      </w:r>
+      <w:proofErr w:type="gramStart"/>
+      <w:r>
+        <w:t>the GSL</w:t>
+      </w:r>
+      <w:proofErr w:type="gramEnd"/>
+      <w:r>
+        <w:t>.</w:t>
       </w:r>
     </w:p>
     <w:p>
@@ -2981,7 +3742,17 @@
         <w:spacing w:before="240" w:line="276" w:lineRule="auto"/>
       </w:pPr>
       <w:r>
-        <w:t>Again, send all of water to GSL, what’s the point of keeping water in Bear Lake and not sending it? Want to send all water, its a good [water] year.</w:t>
+        <w:t xml:space="preserve">Again, send all of water to GSL, what’s the point of keeping water in Bear Lake and not sending it? Want to send all water, </w:t>
+      </w:r>
+      <w:proofErr w:type="spellStart"/>
+      <w:proofErr w:type="gramStart"/>
+      <w:r>
+        <w:t>its</w:t>
+      </w:r>
+      <w:proofErr w:type="spellEnd"/>
+      <w:proofErr w:type="gramEnd"/>
+      <w:r>
+        <w:t xml:space="preserve"> a good [water] year.</w:t>
       </w:r>
     </w:p>
     <w:p>
@@ -2994,7 +3765,28 @@
         <w:spacing w:before="240" w:line="276" w:lineRule="auto"/>
       </w:pPr>
       <w:r>
-        <w:t>P11: Hey, 127k acft , We did it</w:t>
+        <w:t xml:space="preserve">P11: Hey, 127k </w:t>
+      </w:r>
+      <w:proofErr w:type="spellStart"/>
+      <w:proofErr w:type="gramStart"/>
+      <w:r>
+        <w:t>acft</w:t>
+      </w:r>
+      <w:proofErr w:type="spellEnd"/>
+      <w:r>
+        <w:t xml:space="preserve"> ,</w:t>
+      </w:r>
+      <w:proofErr w:type="gramEnd"/>
+      <w:r>
+        <w:t xml:space="preserve"> </w:t>
+      </w:r>
+      <w:proofErr w:type="gramStart"/>
+      <w:r>
+        <w:t>We</w:t>
+      </w:r>
+      <w:proofErr w:type="gramEnd"/>
+      <w:r>
+        <w:t xml:space="preserve"> did it</w:t>
       </w:r>
     </w:p>
     <w:p>
@@ -3135,8 +3927,29 @@
       <w:r>
         <w:t xml:space="preserve">P11: </w:t>
       </w:r>
-      <w:r>
-        <w:t>Its just occuring me to now, all these numbers are negotiable, on the price, on the agricultural yield, consumptive use, volume to savings acount, volume to bank.</w:t>
+      <w:proofErr w:type="spellStart"/>
+      <w:r>
+        <w:t>Its</w:t>
+      </w:r>
+      <w:proofErr w:type="spellEnd"/>
+      <w:r>
+        <w:t xml:space="preserve"> just </w:t>
+      </w:r>
+      <w:proofErr w:type="spellStart"/>
+      <w:r>
+        <w:t>occuring</w:t>
+      </w:r>
+      <w:proofErr w:type="spellEnd"/>
+      <w:r>
+        <w:t xml:space="preserve"> me to now, all these numbers are negotiable, on the price, on the agricultural yield, consumptive use, volume to savings </w:t>
+      </w:r>
+      <w:proofErr w:type="spellStart"/>
+      <w:r>
+        <w:t>acount</w:t>
+      </w:r>
+      <w:proofErr w:type="spellEnd"/>
+      <w:r>
+        <w:t>, volume to bank.</w:t>
       </w:r>
     </w:p>
     <w:p>
@@ -3157,7 +3970,15 @@
         <w:t>s. T</w:t>
       </w:r>
       <w:r>
-        <w:t>here are many ways someone can get paid for consumptive use.</w:t>
+        <w:t xml:space="preserve">here are many ways someone can get paid for </w:t>
+      </w:r>
+      <w:proofErr w:type="gramStart"/>
+      <w:r>
+        <w:t>consumptive use</w:t>
+      </w:r>
+      <w:proofErr w:type="gramEnd"/>
+      <w:r>
+        <w:t>.</w:t>
       </w:r>
       <w:r>
         <w:t xml:space="preserve"> Which things save water?</w:t>
@@ -3174,6 +3995,7 @@
           <w:numId w:val="27"/>
         </w:numPr>
       </w:pPr>
+      <w:proofErr w:type="gramStart"/>
       <w:r>
         <w:lastRenderedPageBreak/>
         <w:t>There</w:t>
@@ -3182,7 +4004,11 @@
         <w:t>’</w:t>
       </w:r>
       <w:r>
-        <w:t>s other folks on the other side that don’t want the fed</w:t>
+        <w:t>s</w:t>
+      </w:r>
+      <w:proofErr w:type="gramEnd"/>
+      <w:r>
+        <w:t xml:space="preserve"> other folks on the other side that don’t want the fed</w:t>
       </w:r>
       <w:r>
         <w:t xml:space="preserve">eral </w:t>
@@ -3212,7 +4038,15 @@
         <w:t>people</w:t>
       </w:r>
       <w:r>
-        <w:t xml:space="preserve"> and politics will take this several ways. You have to see what people will take. If this is voluntary people shouldn't lose money by participating. </w:t>
+        <w:t xml:space="preserve"> and politics will take this several ways. You </w:t>
+      </w:r>
+      <w:proofErr w:type="gramStart"/>
+      <w:r>
+        <w:t>have to</w:t>
+      </w:r>
+      <w:proofErr w:type="gramEnd"/>
+      <w:r>
+        <w:t xml:space="preserve"> see what people will take. If this is voluntary people shouldn't lose money by participating. </w:t>
       </w:r>
     </w:p>
     <w:p>
@@ -3242,11 +4076,16 @@
         <w:t>$</w:t>
       </w:r>
       <w:r>
-        <w:t>59 mil</w:t>
+        <w:t xml:space="preserve">59 </w:t>
+      </w:r>
+      <w:proofErr w:type="spellStart"/>
+      <w:r>
+        <w:t>mil</w:t>
       </w:r>
       <w:r>
         <w:t>ion</w:t>
       </w:r>
+      <w:proofErr w:type="spellEnd"/>
       <w:r>
         <w:t xml:space="preserve"> on </w:t>
       </w:r>
@@ -3254,7 +4093,15 @@
         <w:t>130,</w:t>
       </w:r>
       <w:r>
-        <w:t xml:space="preserve">000 acft. That's expensive water. </w:t>
+        <w:t xml:space="preserve">000 </w:t>
+      </w:r>
+      <w:proofErr w:type="spellStart"/>
+      <w:r>
+        <w:t>acft</w:t>
+      </w:r>
+      <w:proofErr w:type="spellEnd"/>
+      <w:r>
+        <w:t xml:space="preserve">. That's expensive water. </w:t>
       </w:r>
       <w:r>
         <w:t>It's</w:t>
@@ -3263,7 +4110,15 @@
         <w:t xml:space="preserve"> insane expensive water</w:t>
       </w:r>
       <w:r>
-        <w:t xml:space="preserve"> [$450 per acft] for voluntary conservation</w:t>
+        <w:t xml:space="preserve"> [$450 per </w:t>
+      </w:r>
+      <w:proofErr w:type="spellStart"/>
+      <w:r>
+        <w:t>acft</w:t>
+      </w:r>
+      <w:proofErr w:type="spellEnd"/>
+      <w:r>
+        <w:t>] for voluntary conservation</w:t>
       </w:r>
       <w:r>
         <w:t xml:space="preserve">. But if you offer 100$ people won’t participate. </w:t>
@@ -3281,7 +4136,15 @@
         <w:t xml:space="preserve">P11: </w:t>
       </w:r>
       <w:r>
-        <w:t>Would the bank have $50 mill at the start, thats a lot of money, a lot of bargaining power</w:t>
+        <w:t xml:space="preserve">Would the bank have $50 mill at the start, </w:t>
+      </w:r>
+      <w:proofErr w:type="spellStart"/>
+      <w:r>
+        <w:t>thats</w:t>
+      </w:r>
+      <w:proofErr w:type="spellEnd"/>
+      <w:r>
+        <w:t xml:space="preserve"> a lot of money, a lot of bargaining power</w:t>
       </w:r>
       <w:r>
         <w:t xml:space="preserve">. </w:t>
@@ -3305,7 +4168,15 @@
         <w:t xml:space="preserve">P10: </w:t>
       </w:r>
       <w:r>
-        <w:t>In the Colorado River, we had the same amount $50 million</w:t>
+        <w:t xml:space="preserve">In the Colorado River, we had the same </w:t>
+      </w:r>
+      <w:proofErr w:type="gramStart"/>
+      <w:r>
+        <w:t>amount</w:t>
+      </w:r>
+      <w:proofErr w:type="gramEnd"/>
+      <w:r>
+        <w:t xml:space="preserve"> $50 million</w:t>
       </w:r>
       <w:r>
         <w:t xml:space="preserve"> per year for these programs</w:t>
@@ -3391,16 +4262,32 @@
         <w:rPr>
           <w:rFonts w:ascii="Calibri" w:hAnsi="Calibri" w:cs="Calibri"/>
         </w:rPr>
-        <w:t>And how many water users you turn off, if it rains or dry</w:t>
-      </w:r>
+        <w:t xml:space="preserve">And how many water users you turn off, if it rains or </w:t>
+      </w:r>
+      <w:proofErr w:type="gramStart"/>
       <w:r>
         <w:rPr>
           <w:rFonts w:ascii="Calibri" w:hAnsi="Calibri" w:cs="Calibri"/>
         </w:rPr>
+        <w:t>dry</w:t>
+      </w:r>
+      <w:proofErr w:type="gramEnd"/>
+      <w:r>
+        <w:rPr>
+          <w:rFonts w:ascii="Calibri" w:hAnsi="Calibri" w:cs="Calibri"/>
+        </w:rPr>
         <w:t>.</w:t>
       </w:r>
       <w:r>
-        <w:t xml:space="preserve"> GSL will be how it is if it doesn’t rain or snow same with </w:t>
+        <w:t xml:space="preserve"> GSL will be how it is if it doesn’t rain or snow same </w:t>
+      </w:r>
+      <w:proofErr w:type="gramStart"/>
+      <w:r>
+        <w:t>with</w:t>
+      </w:r>
+      <w:proofErr w:type="gramEnd"/>
+      <w:r>
+        <w:t xml:space="preserve"> </w:t>
       </w:r>
       <w:r>
         <w:t>Po</w:t>
@@ -3443,7 +4330,15 @@
         <w:t>P11</w:t>
       </w:r>
       <w:r>
-        <w:t>: If you spend your yearly budget we would get there.</w:t>
+        <w:t xml:space="preserve">: If you spend your yearly budget we </w:t>
+      </w:r>
+      <w:proofErr w:type="gramStart"/>
+      <w:r>
+        <w:t>would</w:t>
+      </w:r>
+      <w:proofErr w:type="gramEnd"/>
+      <w:r>
+        <w:t xml:space="preserve"> get there.</w:t>
       </w:r>
       <w:r>
         <w:t xml:space="preserve"> </w:t>
@@ -3474,7 +4369,39 @@
         <w:t xml:space="preserve"> </w:t>
       </w:r>
       <w:r>
-        <w:t>out in  year 2 but if everyone had double their participation. That is 1 data point but that's what we saw in SCPP. People saw it was real and people doubled their participation. IF everyone doubled their consumptive use maybe that becomes more helpful.</w:t>
+        <w:t xml:space="preserve">out </w:t>
+      </w:r>
+      <w:proofErr w:type="gramStart"/>
+      <w:r>
+        <w:t>in  year</w:t>
+      </w:r>
+      <w:proofErr w:type="gramEnd"/>
+      <w:r>
+        <w:t xml:space="preserve"> 2 but if everyone had double their participation. That is 1 data point but that's what we saw in SCPP. People saw it was real and people doubled their participation. </w:t>
+      </w:r>
+      <w:proofErr w:type="gramStart"/>
+      <w:r>
+        <w:t>IF</w:t>
+      </w:r>
+      <w:proofErr w:type="gramEnd"/>
+      <w:r>
+        <w:t xml:space="preserve"> everyone doubled their </w:t>
+      </w:r>
+      <w:proofErr w:type="gramStart"/>
+      <w:r>
+        <w:t>consumptive use</w:t>
+      </w:r>
+      <w:proofErr w:type="gramEnd"/>
+      <w:r>
+        <w:t xml:space="preserve"> maybe that </w:t>
+      </w:r>
+      <w:proofErr w:type="gramStart"/>
+      <w:r>
+        <w:t>becomes</w:t>
+      </w:r>
+      <w:proofErr w:type="gramEnd"/>
+      <w:r>
+        <w:t xml:space="preserve"> more helpful.</w:t>
       </w:r>
     </w:p>
     <w:p>
@@ -3541,40 +4468,100 @@
         <w:rPr>
           <w:rFonts w:ascii="Calibri" w:hAnsi="Calibri" w:cs="Calibri"/>
         </w:rPr>
-        <w:t>In our experience,</w:t>
-      </w:r>
+        <w:t xml:space="preserve">In our </w:t>
+      </w:r>
+      <w:proofErr w:type="spellStart"/>
+      <w:proofErr w:type="gramStart"/>
       <w:r>
         <w:rPr>
           <w:rFonts w:ascii="Calibri" w:hAnsi="Calibri" w:cs="Calibri"/>
         </w:rPr>
-        <w:t>I in CO</w:t>
+        <w:t>experience,</w:t>
       </w:r>
       <w:r>
         <w:rPr>
           <w:rFonts w:ascii="Calibri" w:hAnsi="Calibri" w:cs="Calibri"/>
         </w:rPr>
-        <w:t xml:space="preserve"> ag is </w:t>
-      </w:r>
+        <w:t>I</w:t>
+      </w:r>
+      <w:proofErr w:type="spellEnd"/>
+      <w:proofErr w:type="gramEnd"/>
       <w:r>
         <w:rPr>
           <w:rFonts w:ascii="Calibri" w:hAnsi="Calibri" w:cs="Calibri"/>
         </w:rPr>
+        <w:t xml:space="preserve"> in CO</w:t>
+      </w:r>
+      <w:r>
+        <w:rPr>
+          <w:rFonts w:ascii="Calibri" w:hAnsi="Calibri" w:cs="Calibri"/>
+        </w:rPr>
+        <w:t xml:space="preserve"> </w:t>
+      </w:r>
+      <w:proofErr w:type="gramStart"/>
+      <w:r>
+        <w:rPr>
+          <w:rFonts w:ascii="Calibri" w:hAnsi="Calibri" w:cs="Calibri"/>
+        </w:rPr>
+        <w:t>ag</w:t>
+      </w:r>
+      <w:proofErr w:type="gramEnd"/>
+      <w:r>
+        <w:rPr>
+          <w:rFonts w:ascii="Calibri" w:hAnsi="Calibri" w:cs="Calibri"/>
+        </w:rPr>
+        <w:t xml:space="preserve"> is </w:t>
+      </w:r>
+      <w:r>
+        <w:rPr>
+          <w:rFonts w:ascii="Calibri" w:hAnsi="Calibri" w:cs="Calibri"/>
+        </w:rPr>
         <w:t>60-70</w:t>
       </w:r>
       <w:r>
         <w:rPr>
           <w:rFonts w:ascii="Calibri" w:hAnsi="Calibri" w:cs="Calibri"/>
         </w:rPr>
-        <w:t>% of use,</w:t>
-      </w:r>
+        <w:t xml:space="preserve">% of </w:t>
+      </w:r>
+      <w:proofErr w:type="gramStart"/>
       <w:r>
         <w:rPr>
           <w:rFonts w:ascii="Calibri" w:hAnsi="Calibri" w:cs="Calibri"/>
         </w:rPr>
+        <w:t>use</w:t>
+      </w:r>
+      <w:proofErr w:type="gramEnd"/>
+      <w:r>
+        <w:rPr>
+          <w:rFonts w:ascii="Calibri" w:hAnsi="Calibri" w:cs="Calibri"/>
+        </w:rPr>
+        <w:t>,</w:t>
+      </w:r>
+      <w:r>
+        <w:rPr>
+          <w:rFonts w:ascii="Calibri" w:hAnsi="Calibri" w:cs="Calibri"/>
+        </w:rPr>
         <w:t xml:space="preserve"> </w:t>
       </w:r>
       <w:r>
-        <w:t>so municipal and industrial savings is not gonna put it over the top.</w:t>
+        <w:t xml:space="preserve">so municipal and industrial savings </w:t>
+      </w:r>
+      <w:proofErr w:type="gramStart"/>
+      <w:r>
+        <w:t>is</w:t>
+      </w:r>
+      <w:proofErr w:type="gramEnd"/>
+      <w:r>
+        <w:t xml:space="preserve"> not </w:t>
+      </w:r>
+      <w:proofErr w:type="spellStart"/>
+      <w:r>
+        <w:t>gonna</w:t>
+      </w:r>
+      <w:proofErr w:type="spellEnd"/>
+      <w:r>
+        <w:t xml:space="preserve"> put it over the top.</w:t>
       </w:r>
       <w:r>
         <w:t xml:space="preserve"> B</w:t>
@@ -3583,7 +4570,21 @@
         <w:rPr>
           <w:rFonts w:ascii="Calibri" w:hAnsi="Calibri" w:cs="Calibri"/>
         </w:rPr>
-        <w:t>ut ag only uses [consumes] 50% of the water. Flood irrigation uses 50%, return flow the other 50%.</w:t>
+        <w:t xml:space="preserve">ut </w:t>
+      </w:r>
+      <w:proofErr w:type="gramStart"/>
+      <w:r>
+        <w:rPr>
+          <w:rFonts w:ascii="Calibri" w:hAnsi="Calibri" w:cs="Calibri"/>
+        </w:rPr>
+        <w:t>ag</w:t>
+      </w:r>
+      <w:proofErr w:type="gramEnd"/>
+      <w:r>
+        <w:rPr>
+          <w:rFonts w:ascii="Calibri" w:hAnsi="Calibri" w:cs="Calibri"/>
+        </w:rPr>
+        <w:t xml:space="preserve"> only uses [consumes] 50% of the water. Flood irrigation uses 50%, return flow the other 50%.</w:t>
       </w:r>
     </w:p>
     <w:p>
@@ -3602,13 +4603,39 @@
         <w:t>co-op</w:t>
       </w:r>
       <w:r>
-        <w:t xml:space="preserve"> in town goes out of business. There is a balance in these communities then the guy who owns the ranch has a new truck but the co-op or</w:t>
+        <w:t xml:space="preserve"> in town goes out of business. There is a balance in these communities </w:t>
+      </w:r>
+      <w:proofErr w:type="gramStart"/>
+      <w:r>
+        <w:t>then</w:t>
+      </w:r>
+      <w:proofErr w:type="gramEnd"/>
+      <w:r>
+        <w:t xml:space="preserve"> the guy who owns the ranch has a new truck but the co-op or</w:t>
       </w:r>
       <w:r>
         <w:t xml:space="preserve"> combine seller and</w:t>
       </w:r>
       <w:r>
-        <w:t xml:space="preserve"> other businesses go out of business cause they are not selling. Its a very intertwined business.</w:t>
+        <w:t xml:space="preserve"> other businesses go out of business </w:t>
+      </w:r>
+      <w:proofErr w:type="gramStart"/>
+      <w:r>
+        <w:t>cause</w:t>
+      </w:r>
+      <w:proofErr w:type="gramEnd"/>
+      <w:r>
+        <w:t xml:space="preserve"> they are not selling. </w:t>
+      </w:r>
+      <w:proofErr w:type="spellStart"/>
+      <w:proofErr w:type="gramStart"/>
+      <w:r>
+        <w:t>Its</w:t>
+      </w:r>
+      <w:proofErr w:type="spellEnd"/>
+      <w:proofErr w:type="gramEnd"/>
+      <w:r>
+        <w:t xml:space="preserve"> a very intertwined business.</w:t>
       </w:r>
     </w:p>
     <w:p>
@@ -3654,7 +4681,21 @@
         <w:rPr>
           <w:rFonts w:ascii="Calibri" w:hAnsi="Calibri" w:cs="Calibri"/>
         </w:rPr>
-        <w:t xml:space="preserve"> rights do not allow this scenario, to allow them to keep their water in beneficial use, that’s a bigger issue.</w:t>
+        <w:t xml:space="preserve"> rights do not allow this </w:t>
+      </w:r>
+      <w:proofErr w:type="gramStart"/>
+      <w:r>
+        <w:rPr>
+          <w:rFonts w:ascii="Calibri" w:hAnsi="Calibri" w:cs="Calibri"/>
+        </w:rPr>
+        <w:t>scenario,</w:t>
+      </w:r>
+      <w:proofErr w:type="gramEnd"/>
+      <w:r>
+        <w:rPr>
+          <w:rFonts w:ascii="Calibri" w:hAnsi="Calibri" w:cs="Calibri"/>
+        </w:rPr>
+        <w:t xml:space="preserve"> to allow them to keep their water in beneficial use, that’s a bigger issue.</w:t>
       </w:r>
     </w:p>
     <w:p>
@@ -3667,13 +4708,39 @@
         <w:spacing w:before="240" w:line="276" w:lineRule="auto"/>
       </w:pPr>
       <w:r>
-        <w:t>There are gonna have to be some things changed to keep their water in current use. I know talking to management its a concern of theirs. This ag leasing thing is already under way. I don’t thin</w:t>
+        <w:t xml:space="preserve">There are </w:t>
+      </w:r>
+      <w:proofErr w:type="spellStart"/>
+      <w:r>
+        <w:t>gonna</w:t>
+      </w:r>
+      <w:proofErr w:type="spellEnd"/>
+      <w:r>
+        <w:t xml:space="preserve"> have to be some things changed to keep their water in current use. I know talking to management </w:t>
+      </w:r>
+      <w:proofErr w:type="spellStart"/>
+      <w:proofErr w:type="gramStart"/>
+      <w:r>
+        <w:t>its</w:t>
+      </w:r>
+      <w:proofErr w:type="spellEnd"/>
+      <w:proofErr w:type="gramEnd"/>
+      <w:r>
+        <w:t xml:space="preserve"> a concern of theirs. This ag leasing thing is already under way. I don’t thin</w:t>
       </w:r>
       <w:r>
         <w:t>k</w:t>
       </w:r>
       <w:r>
-        <w:t xml:space="preserve"> those dollars are gonna come from Box Elder</w:t>
+        <w:t xml:space="preserve"> those dollars are </w:t>
+      </w:r>
+      <w:proofErr w:type="spellStart"/>
+      <w:r>
+        <w:t>gonna</w:t>
+      </w:r>
+      <w:proofErr w:type="spellEnd"/>
+      <w:r>
+        <w:t xml:space="preserve"> come from Box Elder</w:t>
       </w:r>
       <w:r>
         <w:tab/>
@@ -3693,7 +4760,21 @@
           <w:rFonts w:ascii="Calibri" w:hAnsi="Calibri" w:cs="Calibri"/>
         </w:rPr>
         <w:lastRenderedPageBreak/>
-        <w:t>The state Utah comitted $2 million, not a single $ to them [Bear River Canal Company].</w:t>
+        <w:t xml:space="preserve">The state Utah </w:t>
+      </w:r>
+      <w:proofErr w:type="spellStart"/>
+      <w:r>
+        <w:rPr>
+          <w:rFonts w:ascii="Calibri" w:hAnsi="Calibri" w:cs="Calibri"/>
+        </w:rPr>
+        <w:t>comitted</w:t>
+      </w:r>
+      <w:proofErr w:type="spellEnd"/>
+      <w:r>
+        <w:rPr>
+          <w:rFonts w:ascii="Calibri" w:hAnsi="Calibri" w:cs="Calibri"/>
+        </w:rPr>
+        <w:t xml:space="preserve"> $2 million, not a single $ to them [Bear River Canal Company].</w:t>
       </w:r>
     </w:p>
     <w:p>
@@ -3712,7 +4793,23 @@
         <w:t xml:space="preserve"> i</w:t>
       </w:r>
       <w:r>
-        <w:t>s cutler dam and that seems like the best place to shepherd it but that company can’t do it with their water rights. Politically there's gonna have to be some change as well.</w:t>
+        <w:t xml:space="preserve">s cutler dam and that seems like the best place to shepherd </w:t>
+      </w:r>
+      <w:proofErr w:type="gramStart"/>
+      <w:r>
+        <w:t>it</w:t>
+      </w:r>
+      <w:proofErr w:type="gramEnd"/>
+      <w:r>
+        <w:t xml:space="preserve"> but that company can’t do it with their water rights. Politically there's </w:t>
+      </w:r>
+      <w:proofErr w:type="spellStart"/>
+      <w:r>
+        <w:t>gonna</w:t>
+      </w:r>
+      <w:proofErr w:type="spellEnd"/>
+      <w:r>
+        <w:t xml:space="preserve"> have to be some change as well.</w:t>
       </w:r>
     </w:p>
     <w:p>
@@ -3822,7 +4919,31 @@
         </w:numPr>
       </w:pPr>
       <w:r>
-        <w:t>, have to show the GSL improve, noteable improvements in the lake, to justify $200 million over 4 years</w:t>
+        <w:t xml:space="preserve">, </w:t>
+      </w:r>
+      <w:proofErr w:type="gramStart"/>
+      <w:r>
+        <w:t>have to</w:t>
+      </w:r>
+      <w:proofErr w:type="gramEnd"/>
+      <w:r>
+        <w:t xml:space="preserve"> show the GSL </w:t>
+      </w:r>
+      <w:proofErr w:type="gramStart"/>
+      <w:r>
+        <w:t>improve</w:t>
+      </w:r>
+      <w:proofErr w:type="gramEnd"/>
+      <w:r>
+        <w:t xml:space="preserve">, </w:t>
+      </w:r>
+      <w:proofErr w:type="spellStart"/>
+      <w:r>
+        <w:t>noteable</w:t>
+      </w:r>
+      <w:proofErr w:type="spellEnd"/>
+      <w:r>
+        <w:t xml:space="preserve"> improvements in the lake, to justify $200 million over 4 years</w:t>
       </w:r>
       <w:r>
         <w:t xml:space="preserve"> as in this scenario.</w:t>
@@ -3873,7 +4994,66 @@
         <w:spacing w:before="240" w:line="276" w:lineRule="auto"/>
       </w:pPr>
       <w:r>
-        <w:t xml:space="preserve">As long as its  a voluntary program its a tool its a way to test things to see what people are willing to do. If you are able to get a quantifiable amount of water in the lake. Its a step people can build on. </w:t>
+        <w:t xml:space="preserve">As long as </w:t>
+      </w:r>
+      <w:proofErr w:type="spellStart"/>
+      <w:proofErr w:type="gramStart"/>
+      <w:r>
+        <w:t>its</w:t>
+      </w:r>
+      <w:proofErr w:type="spellEnd"/>
+      <w:r>
+        <w:t xml:space="preserve">  a</w:t>
+      </w:r>
+      <w:proofErr w:type="gramEnd"/>
+      <w:r>
+        <w:t xml:space="preserve"> voluntary </w:t>
+      </w:r>
+      <w:proofErr w:type="gramStart"/>
+      <w:r>
+        <w:t>program</w:t>
+      </w:r>
+      <w:proofErr w:type="gramEnd"/>
+      <w:r>
+        <w:t xml:space="preserve"> </w:t>
+      </w:r>
+      <w:proofErr w:type="spellStart"/>
+      <w:proofErr w:type="gramStart"/>
+      <w:r>
+        <w:t>its</w:t>
+      </w:r>
+      <w:proofErr w:type="spellEnd"/>
+      <w:proofErr w:type="gramEnd"/>
+      <w:r>
+        <w:t xml:space="preserve"> a tool </w:t>
+      </w:r>
+      <w:proofErr w:type="spellStart"/>
+      <w:proofErr w:type="gramStart"/>
+      <w:r>
+        <w:t>its</w:t>
+      </w:r>
+      <w:proofErr w:type="spellEnd"/>
+      <w:proofErr w:type="gramEnd"/>
+      <w:r>
+        <w:t xml:space="preserve"> a way to test things to see what people are willing to do. If you </w:t>
+      </w:r>
+      <w:proofErr w:type="gramStart"/>
+      <w:r>
+        <w:t>are able to</w:t>
+      </w:r>
+      <w:proofErr w:type="gramEnd"/>
+      <w:r>
+        <w:t xml:space="preserve"> get a quantifiable amount of water in the lake. </w:t>
+      </w:r>
+      <w:proofErr w:type="spellStart"/>
+      <w:proofErr w:type="gramStart"/>
+      <w:r>
+        <w:t>Its</w:t>
+      </w:r>
+      <w:proofErr w:type="spellEnd"/>
+      <w:proofErr w:type="gramEnd"/>
+      <w:r>
+        <w:t xml:space="preserve"> a step people can build on. </w:t>
       </w:r>
     </w:p>
     <w:p>
@@ -3886,7 +5066,15 @@
         <w:spacing w:before="240" w:line="276" w:lineRule="auto"/>
       </w:pPr>
       <w:r>
-        <w:t xml:space="preserve">Federal funding needs to fall into place to make 200 mil available. Ppl participate, somebody sees an actual benefit. </w:t>
+        <w:t xml:space="preserve">Federal funding needs to fall into place to make 200 mil available. Ppl </w:t>
+      </w:r>
+      <w:proofErr w:type="gramStart"/>
+      <w:r>
+        <w:t>participate,</w:t>
+      </w:r>
+      <w:proofErr w:type="gramEnd"/>
+      <w:r>
+        <w:t xml:space="preserve"> somebody sees an actual benefit. </w:t>
       </w:r>
     </w:p>
     <w:p>
@@ -3948,7 +5136,15 @@
         <w:t>be</w:t>
       </w:r>
       <w:r>
-        <w:t>cause they get this bump. The d</w:t>
+        <w:t xml:space="preserve">cause they get this bump. </w:t>
+      </w:r>
+      <w:proofErr w:type="gramStart"/>
+      <w:r>
+        <w:t>The</w:t>
+      </w:r>
+      <w:proofErr w:type="gramEnd"/>
+      <w:r>
+        <w:t xml:space="preserve"> d</w:t>
       </w:r>
       <w:r>
         <w:t>on</w:t>
@@ -3969,7 +5165,23 @@
         <w:t xml:space="preserve"> the farmers have the option, they can build/improve their irrigation system during those years [that they take payments to conserve].</w:t>
       </w:r>
       <w:r>
-        <w:t xml:space="preserve"> So when they go back they can make it better. </w:t>
+        <w:t xml:space="preserve"> </w:t>
+      </w:r>
+      <w:proofErr w:type="gramStart"/>
+      <w:r>
+        <w:t>So</w:t>
+      </w:r>
+      <w:proofErr w:type="gramEnd"/>
+      <w:r>
+        <w:t xml:space="preserve"> when they go </w:t>
+      </w:r>
+      <w:proofErr w:type="gramStart"/>
+      <w:r>
+        <w:t>back</w:t>
+      </w:r>
+      <w:proofErr w:type="gramEnd"/>
+      <w:r>
+        <w:t xml:space="preserve"> they can make it better. </w:t>
       </w:r>
     </w:p>
     <w:p>
@@ -3997,7 +5209,23 @@
         <w:t>municipalities</w:t>
       </w:r>
       <w:r>
-        <w:t xml:space="preserve">. IF we can prevent buy and dry that helps the communities in the long run. </w:t>
+        <w:t xml:space="preserve">. </w:t>
+      </w:r>
+      <w:proofErr w:type="gramStart"/>
+      <w:r>
+        <w:t>IF</w:t>
+      </w:r>
+      <w:proofErr w:type="gramEnd"/>
+      <w:r>
+        <w:t xml:space="preserve"> we can prevent buy and </w:t>
+      </w:r>
+      <w:proofErr w:type="gramStart"/>
+      <w:r>
+        <w:t>dry</w:t>
+      </w:r>
+      <w:proofErr w:type="gramEnd"/>
+      <w:r>
+        <w:t xml:space="preserve"> that helps the communities in the long run. </w:t>
       </w:r>
     </w:p>
     <w:p>
@@ -4012,7 +5240,23 @@
         <w:t xml:space="preserve">P11: </w:t>
       </w:r>
       <w:r>
-        <w:t>I was going to read between the two – people – some of the dominos include shepharding water through the basin, there has to be trust, it will work better for the lake</w:t>
+        <w:t xml:space="preserve">I was going to read between the two – people – some of the dominos include </w:t>
+      </w:r>
+      <w:proofErr w:type="spellStart"/>
+      <w:r>
+        <w:t>shepharding</w:t>
+      </w:r>
+      <w:proofErr w:type="spellEnd"/>
+      <w:r>
+        <w:t xml:space="preserve"> water through the basin, there </w:t>
+      </w:r>
+      <w:proofErr w:type="gramStart"/>
+      <w:r>
+        <w:t>has to</w:t>
+      </w:r>
+      <w:proofErr w:type="gramEnd"/>
+      <w:r>
+        <w:t xml:space="preserve"> be trust, it will work better for the lake</w:t>
       </w:r>
     </w:p>
     <w:p>
@@ -4101,7 +5345,15 @@
         <w:t xml:space="preserve"> people</w:t>
       </w:r>
       <w:r>
-        <w:t xml:space="preserve"> in the cities pointing at farmers wanting them to change the way they've lived for generations and they point back saying stop watering your law. Ppl in cities need to voluntarily implement these practices or require them to</w:t>
+        <w:t xml:space="preserve"> in the cities pointing at farmers wanting them to change the way they've lived for </w:t>
+      </w:r>
+      <w:proofErr w:type="gramStart"/>
+      <w:r>
+        <w:t>generations</w:t>
+      </w:r>
+      <w:proofErr w:type="gramEnd"/>
+      <w:r>
+        <w:t xml:space="preserve"> and they point back saying stop watering your law. Ppl in cities need to voluntarily implement these practices or require them to</w:t>
       </w:r>
       <w:r>
         <w:t>.</w:t>
@@ -4146,7 +5398,21 @@
         <w:rPr>
           <w:rFonts w:ascii="Calibri" w:hAnsi="Calibri" w:cs="Calibri"/>
         </w:rPr>
-        <w:t>: If we can incentivize different measure to help them. If at the end of the day they get the same crop with less water they're happy. There are technologies out there like flood irrigation. If there was some sort of incentive to help farmers install more efficient irrigation systems that would free up a large amount of water</w:t>
+        <w:t xml:space="preserve">: If we can incentivize different </w:t>
+      </w:r>
+      <w:proofErr w:type="gramStart"/>
+      <w:r>
+        <w:rPr>
+          <w:rFonts w:ascii="Calibri" w:hAnsi="Calibri" w:cs="Calibri"/>
+        </w:rPr>
+        <w:t>measure</w:t>
+      </w:r>
+      <w:proofErr w:type="gramEnd"/>
+      <w:r>
+        <w:rPr>
+          <w:rFonts w:ascii="Calibri" w:hAnsi="Calibri" w:cs="Calibri"/>
+        </w:rPr>
+        <w:t xml:space="preserve"> to help them. If at the end of the day they get the same crop with less water they're happy. There are technologies out there like flood irrigation. If there was some sort of incentive to help farmers install more efficient irrigation systems that would free up a large amount of water</w:t>
       </w:r>
     </w:p>
     <w:p>
@@ -4334,7 +5600,23 @@
           <w:b/>
           <w:bCs/>
         </w:rPr>
-        <w:t>Who benefits and loses in the scenario of Bear River water banking with the purpose to get more water to GSL? </w:t>
+        <w:t xml:space="preserve">Who benefits and loses in the scenario of Bear River water banking with the purpose </w:t>
+      </w:r>
+      <w:proofErr w:type="gramStart"/>
+      <w:r>
+        <w:rPr>
+          <w:b/>
+          <w:bCs/>
+        </w:rPr>
+        <w:t>to get</w:t>
+      </w:r>
+      <w:proofErr w:type="gramEnd"/>
+      <w:r>
+        <w:rPr>
+          <w:b/>
+          <w:bCs/>
+        </w:rPr>
+        <w:t xml:space="preserve"> more water to GSL? </w:t>
       </w:r>
     </w:p>
     <w:p>
@@ -4354,7 +5636,23 @@
         <w:t>P11: W</w:t>
       </w:r>
       <w:r>
-        <w:t xml:space="preserve">here this money is coming from, if comes from the Federal government, distribute across all of use. There can’t be people in the country who want to see the GSL </w:t>
+        <w:t xml:space="preserve">here this money is coming from, if comes from the Federal government, distribute across all of </w:t>
+      </w:r>
+      <w:proofErr w:type="gramStart"/>
+      <w:r>
+        <w:t>use</w:t>
+      </w:r>
+      <w:proofErr w:type="gramEnd"/>
+      <w:r>
+        <w:t xml:space="preserve">. There can’t be people in the country who want to see </w:t>
+      </w:r>
+      <w:proofErr w:type="gramStart"/>
+      <w:r>
+        <w:t>the GSL</w:t>
+      </w:r>
+      <w:proofErr w:type="gramEnd"/>
+      <w:r>
+        <w:t xml:space="preserve"> </w:t>
       </w:r>
       <w:r>
         <w:t>dry up</w:t>
@@ -4382,8 +5680,13 @@
       <w:r>
         <w:t xml:space="preserve">it’s </w:t>
       </w:r>
-      <w:r>
-        <w:t>volunary, then there are not any losers.</w:t>
+      <w:proofErr w:type="spellStart"/>
+      <w:r>
+        <w:t>volunary</w:t>
+      </w:r>
+      <w:proofErr w:type="spellEnd"/>
+      <w:r>
+        <w:t>, then there are not any losers.</w:t>
       </w:r>
     </w:p>
     <w:p>
@@ -4413,7 +5716,31 @@
         <w:spacing w:before="240" w:line="276" w:lineRule="auto"/>
       </w:pPr>
       <w:r>
-        <w:t xml:space="preserve">P11: For each water user considering banking vs using in a given year there's gonna be a price point. --- Thinking of the different ways to build that mutual trust btw urban users watering their lawns VS people making their living off their land on that water. We made new rules on overhead sprinklers in logan UT or more specific sprinklers and use that as a show of faith. </w:t>
+        <w:t xml:space="preserve">P11: For each water user considering banking vs using </w:t>
+      </w:r>
+      <w:proofErr w:type="gramStart"/>
+      <w:r>
+        <w:t>in a given year</w:t>
+      </w:r>
+      <w:proofErr w:type="gramEnd"/>
+      <w:r>
+        <w:t xml:space="preserve"> there's </w:t>
+      </w:r>
+      <w:proofErr w:type="spellStart"/>
+      <w:r>
+        <w:t>gonna</w:t>
+      </w:r>
+      <w:proofErr w:type="spellEnd"/>
+      <w:r>
+        <w:t xml:space="preserve"> be a price point. --- Thinking of the different ways to build </w:t>
+      </w:r>
+      <w:proofErr w:type="gramStart"/>
+      <w:r>
+        <w:t>that mutual</w:t>
+      </w:r>
+      <w:proofErr w:type="gramEnd"/>
+      <w:r>
+        <w:t xml:space="preserve"> trust btw urban users watering their lawns VS people making their living off their land on that water. We made new rules on overhead sprinklers in logan UT or more specific sprinklers and use that as a show of faith. </w:t>
       </w:r>
     </w:p>
     <w:p>
@@ -4426,7 +5753,15 @@
         <w:spacing w:before="240" w:line="276" w:lineRule="auto"/>
       </w:pPr>
       <w:r>
-        <w:t>Who else is willing to come along? Demonstrating that people are willing to participate could get people to lower their price point in a given year.</w:t>
+        <w:t xml:space="preserve">Who else is willing to come along? Demonstrating that people are willing to participate could get people to lower their price point </w:t>
+      </w:r>
+      <w:proofErr w:type="gramStart"/>
+      <w:r>
+        <w:t>in a given year</w:t>
+      </w:r>
+      <w:proofErr w:type="gramEnd"/>
+      <w:r>
+        <w:t>.</w:t>
       </w:r>
     </w:p>
     <w:p>
@@ -4482,7 +5817,15 @@
         <w:spacing w:before="240" w:line="276" w:lineRule="auto"/>
       </w:pPr>
       <w:r>
-        <w:t xml:space="preserve">I’d love a more directed homework ahead of time. If </w:t>
+        <w:t xml:space="preserve">I’d love </w:t>
+      </w:r>
+      <w:proofErr w:type="gramStart"/>
+      <w:r>
+        <w:t>a more</w:t>
+      </w:r>
+      <w:proofErr w:type="gramEnd"/>
+      <w:r>
+        <w:t xml:space="preserve"> directed homework ahead of time. If </w:t>
       </w:r>
     </w:p>
     <w:p>
@@ -4549,7 +5892,15 @@
         <w:spacing w:before="240" w:line="276" w:lineRule="auto"/>
       </w:pPr>
       <w:r>
-        <w:t>It’s definitely interesting, trying to weave all this stuff together.</w:t>
+        <w:t xml:space="preserve">It’s </w:t>
+      </w:r>
+      <w:proofErr w:type="gramStart"/>
+      <w:r>
+        <w:t>definitely interesting</w:t>
+      </w:r>
+      <w:proofErr w:type="gramEnd"/>
+      <w:r>
+        <w:t>, trying to weave all this stuff together.</w:t>
       </w:r>
     </w:p>
     <w:p>
@@ -4621,7 +5972,28 @@
         <w:t>h</w:t>
       </w:r>
       <w:r>
-        <w:t>is group really challenged each other, and built off each others thoughts.</w:t>
+        <w:t xml:space="preserve">is group really challenged </w:t>
+      </w:r>
+      <w:proofErr w:type="gramStart"/>
+      <w:r>
+        <w:t>each other, and</w:t>
+      </w:r>
+      <w:proofErr w:type="gramEnd"/>
+      <w:r>
+        <w:t xml:space="preserve"> built off </w:t>
+      </w:r>
+      <w:proofErr w:type="spellStart"/>
+      <w:r>
+        <w:t xml:space="preserve">each </w:t>
+      </w:r>
+      <w:proofErr w:type="gramStart"/>
+      <w:r>
+        <w:t>others</w:t>
+      </w:r>
+      <w:proofErr w:type="spellEnd"/>
+      <w:proofErr w:type="gramEnd"/>
+      <w:r>
+        <w:t xml:space="preserve"> thoughts.</w:t>
       </w:r>
     </w:p>
     <w:p>
@@ -4660,7 +6032,15 @@
         <w:spacing w:before="240" w:line="276" w:lineRule="auto"/>
       </w:pPr>
       <w:r>
-        <w:t>Who is responsible to be the bank?</w:t>
+        <w:t xml:space="preserve">Who is responsible </w:t>
+      </w:r>
+      <w:proofErr w:type="gramStart"/>
+      <w:r>
+        <w:t>to be</w:t>
+      </w:r>
+      <w:proofErr w:type="gramEnd"/>
+      <w:r>
+        <w:t xml:space="preserve"> the bank?</w:t>
       </w:r>
     </w:p>
     <w:p>
@@ -4676,7 +6056,15 @@
         <w:t>Interesting</w:t>
       </w:r>
       <w:r>
-        <w:t xml:space="preserve"> that trust came up on its own, trust that between ag users and cities, that they would both do their part to reduce usage (lateral), and trust between agriculture and higher levels of government (vertical).</w:t>
+        <w:t xml:space="preserve"> that trust came up on its own, </w:t>
+      </w:r>
+      <w:proofErr w:type="gramStart"/>
+      <w:r>
+        <w:t>trust that</w:t>
+      </w:r>
+      <w:proofErr w:type="gramEnd"/>
+      <w:r>
+        <w:t xml:space="preserve"> between ag users and cities, that they would both do their part to reduce usage (lateral), and trust between agriculture and higher levels of government (vertical).</w:t>
       </w:r>
     </w:p>
     <w:p>
@@ -9265,6 +10653,7 @@
   <w:style w:type="character" w:default="1" w:styleId="DefaultParagraphFont">
     <w:name w:val="Default Paragraph Font"/>
     <w:uiPriority w:val="1"/>
+    <w:semiHidden/>
     <w:unhideWhenUsed/>
   </w:style>
   <w:style w:type="table" w:default="1" w:styleId="TableNormal">

</xml_diff>